<commit_message>
docs: completar nombres de los integrantes en README e informe
</commit_message>
<xml_diff>
--- a/informe/Informe_PRAC02_Manejo_de_Errores_Grupo1.docx
+++ b/informe/Informe_PRAC02_Manejo_de_Errores_Grupo1.docx
@@ -165,7 +165,7 @@
         <w:spacing w:after="300"/>
         <w:jc w:val="center"/>
       </w:pPr>
-      <w:hyperlink w:history="1" r:id="rIdplr3aq7fmmkvmzvase1l4">
+      <w:hyperlink w:history="1" r:id="rIdll_-4aqhy4umiqluafkpk">
         <w:r>
           <w:rPr>
             <w:rStyle w:val="Hyperlink"/>
@@ -211,51 +211,6 @@
     </w:p>
     <w:p>
       <w:pPr>
-        <w:spacing w:after="60"/>
-        <w:jc w:val="center"/>
-      </w:pPr>
-      <w:r>
-        <w:rPr>
-          <w:rFonts w:ascii="Times New Roman" w:cs="Times New Roman" w:eastAsia="Times New Roman" w:hAnsi="Times New Roman"/>
-          <w:sz w:val="20"/>
-          <w:szCs w:val="20"/>
-          <w:highlight w:val="yellow"/>
-        </w:rPr>
-        <w:t xml:space="preserve">[APELLIDOS] DIEGO</w:t>
-      </w:r>
-    </w:p>
-    <w:p>
-      <w:pPr>
-        <w:spacing w:after="60"/>
-        <w:jc w:val="center"/>
-      </w:pPr>
-      <w:r>
-        <w:rPr>
-          <w:rFonts w:ascii="Times New Roman" w:cs="Times New Roman" w:eastAsia="Times New Roman" w:hAnsi="Times New Roman"/>
-          <w:sz w:val="20"/>
-          <w:szCs w:val="20"/>
-          <w:highlight w:val="yellow"/>
-        </w:rPr>
-        <w:t xml:space="preserve">[APELLIDOS] ELKIN</w:t>
-      </w:r>
-    </w:p>
-    <w:p>
-      <w:pPr>
-        <w:spacing w:after="60"/>
-        <w:jc w:val="center"/>
-      </w:pPr>
-      <w:r>
-        <w:rPr>
-          <w:rFonts w:ascii="Times New Roman" w:cs="Times New Roman" w:eastAsia="Times New Roman" w:hAnsi="Times New Roman"/>
-          <w:sz w:val="20"/>
-          <w:szCs w:val="20"/>
-          <w:highlight w:val="yellow"/>
-        </w:rPr>
-        <w:t xml:space="preserve">[APELLIDOS] FERNANDO</w:t>
-      </w:r>
-    </w:p>
-    <w:p>
-      <w:pPr>
         <w:spacing w:after="60" w:before="0" w:line="276"/>
         <w:jc w:val="center"/>
       </w:pPr>
@@ -272,7 +227,7 @@
     </w:p>
     <w:p>
       <w:pPr>
-        <w:spacing w:after="300" w:before="0" w:line="276"/>
+        <w:spacing w:after="60" w:before="0" w:line="276"/>
         <w:jc w:val="center"/>
       </w:pPr>
       <w:r>
@@ -284,6 +239,54 @@
           <w:szCs w:val="20"/>
         </w:rPr>
         <w:t xml:space="preserve">QUISPE MAMANI JOSE GABRIEL</w:t>
+      </w:r>
+    </w:p>
+    <w:p>
+      <w:pPr>
+        <w:spacing w:after="60" w:before="0" w:line="276"/>
+        <w:jc w:val="center"/>
+      </w:pPr>
+      <w:r>
+        <w:rPr>
+          <w:rFonts w:ascii="Times New Roman" w:cs="Times New Roman" w:eastAsia="Times New Roman" w:hAnsi="Times New Roman"/>
+          <w:b w:val="false"/>
+          <w:bCs w:val="false"/>
+          <w:sz w:val="20"/>
+          <w:szCs w:val="20"/>
+        </w:rPr>
+        <w:t xml:space="preserve">RAMOS OCHOCHOQUE ELKIN EDER B.</w:t>
+      </w:r>
+    </w:p>
+    <w:p>
+      <w:pPr>
+        <w:spacing w:after="60" w:before="0" w:line="276"/>
+        <w:jc w:val="center"/>
+      </w:pPr>
+      <w:r>
+        <w:rPr>
+          <w:rFonts w:ascii="Times New Roman" w:cs="Times New Roman" w:eastAsia="Times New Roman" w:hAnsi="Times New Roman"/>
+          <w:b w:val="false"/>
+          <w:bCs w:val="false"/>
+          <w:sz w:val="20"/>
+          <w:szCs w:val="20"/>
+        </w:rPr>
+        <w:t xml:space="preserve">SCHREIBER LANDEO DIEGO HANS</w:t>
+      </w:r>
+    </w:p>
+    <w:p>
+      <w:pPr>
+        <w:spacing w:after="300" w:before="0" w:line="276"/>
+        <w:jc w:val="center"/>
+      </w:pPr>
+      <w:r>
+        <w:rPr>
+          <w:rFonts w:ascii="Times New Roman" w:cs="Times New Roman" w:eastAsia="Times New Roman" w:hAnsi="Times New Roman"/>
+          <w:b w:val="false"/>
+          <w:bCs w:val="false"/>
+          <w:sz w:val="20"/>
+          <w:szCs w:val="20"/>
+        </w:rPr>
+        <w:t xml:space="preserve">SOLSOL CHOQUE FERNANDO RAFAEL</w:t>
       </w:r>
     </w:p>
     <w:p>
@@ -804,7 +807,7 @@
         </w:rPr>
         <w:t xml:space="preserve">El presente informe documenta la Práctica 02 del curso Tecnología de Objetos, desarrollada por el Grupo 1 en el lenguaje C++. Comprende dos actividades: la Práctica 1, División segura, y la Simulación de sistema, común a todos los grupos, en la que se construyó un sistema de registro de alumnos que integra el manejo de errores de entrada de datos, de archivos no encontrados o corruptos y de excepciones personalizadas. El código fuente se encuentra en el repositorio del grupo: </w:t>
       </w:r>
-      <w:hyperlink w:history="1" r:id="rIdlirhrfhrp0easji7dsz53">
+      <w:hyperlink w:history="1" r:id="rIdbnoetmxust6rz-fki8i5w">
         <w:r>
           <w:rPr>
             <w:rStyle w:val="Hyperlink"/>

</xml_diff>

<commit_message>
docs: actualizar informe final
</commit_message>
<xml_diff>
--- a/informe/Informe_PRAC02_Manejo_de_Errores_Grupo1.docx
+++ b/informe/Informe_PRAC02_Manejo_de_Errores_Grupo1.docx
@@ -165,7 +165,7 @@
         <w:spacing w:after="300"/>
         <w:jc w:val="center"/>
       </w:pPr>
-      <w:hyperlink w:history="1" r:id="rIdll_-4aqhy4umiqluafkpk">
+      <w:hyperlink w:history="1" r:id="rIdygi7ppyxqfcshvxdse-vg">
         <w:r>
           <w:rPr>
             <w:rStyle w:val="Hyperlink"/>
@@ -307,17 +307,18 @@
     </w:p>
     <w:p>
       <w:pPr>
-        <w:spacing w:after="360"/>
+        <w:spacing w:after="360" w:before="0" w:line="276"/>
         <w:jc w:val="center"/>
       </w:pPr>
       <w:r>
         <w:rPr>
           <w:rFonts w:ascii="Times New Roman" w:cs="Times New Roman" w:eastAsia="Times New Roman" w:hAnsi="Times New Roman"/>
+          <w:b w:val="false"/>
+          <w:bCs w:val="false"/>
           <w:sz w:val="20"/>
           <w:szCs w:val="20"/>
-          <w:highlight w:val="yellow"/>
-        </w:rPr>
-        <w:t xml:space="preserve">[NOMBRE DEL DOCENTE]</w:t>
+        </w:rPr>
+        <w:t xml:space="preserve">Mg. Maribel Molina Barriga</w:t>
       </w:r>
     </w:p>
     <w:p>
@@ -807,7 +808,7 @@
         </w:rPr>
         <w:t xml:space="preserve">El presente informe documenta la Práctica 02 del curso Tecnología de Objetos, desarrollada por el Grupo 1 en el lenguaje C++. Comprende dos actividades: la Práctica 1, División segura, y la Simulación de sistema, común a todos los grupos, en la que se construyó un sistema de registro de alumnos que integra el manejo de errores de entrada de datos, de archivos no encontrados o corruptos y de excepciones personalizadas. El código fuente se encuentra en el repositorio del grupo: </w:t>
       </w:r>
-      <w:hyperlink w:history="1" r:id="rIdbnoetmxust6rz-fki8i5w">
+      <w:hyperlink w:history="1" r:id="rIdn0pysltq1xstiebz-29ob">
         <w:r>
           <w:rPr>
             <w:rStyle w:val="Hyperlink"/>
@@ -3009,20 +3010,652 @@
         <w:rPr>
           <w:rFonts w:ascii="Times New Roman" w:cs="Times New Roman" w:eastAsia="Times New Roman" w:hAnsi="Times New Roman"/>
         </w:rPr>
-        <w:t xml:space="preserve">El objetivo de esta práctica es evitar que el programa se detenga por una división entre cero. El programa solicita dos números al usuario; la función dividir comprueba el divisor y, si es cero, lanza una excepción std::domain_error. La llamada se realiza dentro de un bloque try y el bloque catch muestra un mensaje adecuado. El mensaje de cierre se implementa en el destructor de una estructura MensajeCierre, de modo que se muestra siempre, como lo haría un bloque finally.</w:t>
-      </w:r>
-    </w:p>
-    <w:p>
-      <w:pPr>
-        <w:spacing w:line="480"/>
-        <w:ind w:firstLine="720"/>
-      </w:pPr>
-      <w:r>
-        <w:rPr>
-          <w:rFonts w:ascii="Times New Roman" w:cs="Times New Roman" w:eastAsia="Times New Roman" w:hAnsi="Times New Roman"/>
-          <w:highlight w:val="yellow"/>
-        </w:rPr>
-        <w:t xml:space="preserve">[Insertar el código final de practica1-division-segura/division_segura.cpp]</w:t>
+        <w:t xml:space="preserve">El objetivo de esta práctica es evitar que el programa se detenga por una división entre cero. El programa solicita dos números al usuario; la función dividir comprueba el divisor y, si es cero, lanza una excepción std::domain_error. La llamada se realiza dentro de un bloque try y el bloque catch muestra un mensaje adecuado. El mensaje de cierre se implementa en el destructor de una estructura MensajeCierre. El objeto se declara en un bloque que envuelve al try y al catch, de modo que su destructor se ejecuta después de ambos y el mensaje se muestra siempre, como lo haría un bloque finally. Como extra, si el usuario no ingresa un número se lanza std::invalid_argument.</w:t>
+      </w:r>
+    </w:p>
+    <w:p>
+      <w:pPr>
+        <w:shd w:fill="F2F2F2" w:color="auto" w:val="clear"/>
+        <w:spacing w:after="0" w:before="120" w:line="240"/>
+        <w:ind w:left="360"/>
+      </w:pPr>
+      <w:r>
+        <w:rPr>
+          <w:rFonts w:ascii="Consolas" w:cs="Consolas" w:eastAsia="Consolas" w:hAnsi="Consolas"/>
+          <w:sz w:val="18"/>
+          <w:szCs w:val="18"/>
+        </w:rPr>
+        <w:t xml:space="preserve">// Práctica 1: División segura</w:t>
+      </w:r>
+    </w:p>
+    <w:p>
+      <w:pPr>
+        <w:shd w:fill="F2F2F2" w:color="auto" w:val="clear"/>
+        <w:spacing w:after="0" w:before="0" w:line="240"/>
+        <w:ind w:left="360"/>
+      </w:pPr>
+      <w:r>
+        <w:rPr>
+          <w:rFonts w:ascii="Consolas" w:cs="Consolas" w:eastAsia="Consolas" w:hAnsi="Consolas"/>
+          <w:sz w:val="18"/>
+          <w:szCs w:val="18"/>
+        </w:rPr>
+        <w:t xml:space="preserve">#include &lt;iostream&gt;</w:t>
+      </w:r>
+    </w:p>
+    <w:p>
+      <w:pPr>
+        <w:shd w:fill="F2F2F2" w:color="auto" w:val="clear"/>
+        <w:spacing w:after="0" w:before="0" w:line="240"/>
+        <w:ind w:left="360"/>
+      </w:pPr>
+      <w:r>
+        <w:rPr>
+          <w:rFonts w:ascii="Consolas" w:cs="Consolas" w:eastAsia="Consolas" w:hAnsi="Consolas"/>
+          <w:sz w:val="18"/>
+          <w:szCs w:val="18"/>
+        </w:rPr>
+        <w:t xml:space="preserve">#include &lt;stdexcept&gt;</w:t>
+      </w:r>
+    </w:p>
+    <w:p>
+      <w:pPr>
+        <w:shd w:fill="F2F2F2" w:color="auto" w:val="clear"/>
+        <w:spacing w:after="0" w:before="0" w:line="240"/>
+        <w:ind w:left="360"/>
+      </w:pPr>
+      <w:r>
+        <w:rPr>
+          <w:rFonts w:ascii="Consolas" w:cs="Consolas" w:eastAsia="Consolas" w:hAnsi="Consolas"/>
+          <w:sz w:val="18"/>
+          <w:szCs w:val="18"/>
+        </w:rPr>
+        <w:t xml:space="preserve">#include &lt;string&gt;</w:t>
+      </w:r>
+    </w:p>
+    <w:p>
+      <w:pPr>
+        <w:shd w:fill="F2F2F2" w:color="auto" w:val="clear"/>
+        <w:spacing w:after="0" w:before="0" w:line="240"/>
+        <w:ind w:left="360"/>
+      </w:pPr>
+      <w:r>
+        <w:rPr>
+          <w:rFonts w:ascii="Consolas" w:cs="Consolas" w:eastAsia="Consolas" w:hAnsi="Consolas"/>
+          <w:sz w:val="18"/>
+          <w:szCs w:val="18"/>
+        </w:rPr>
+        <w:t xml:space="preserve"> </w:t>
+      </w:r>
+    </w:p>
+    <w:p>
+      <w:pPr>
+        <w:shd w:fill="F2F2F2" w:color="auto" w:val="clear"/>
+        <w:spacing w:after="0" w:before="0" w:line="240"/>
+        <w:ind w:left="360"/>
+      </w:pPr>
+      <w:r>
+        <w:rPr>
+          <w:rFonts w:ascii="Consolas" w:cs="Consolas" w:eastAsia="Consolas" w:hAnsi="Consolas"/>
+          <w:sz w:val="18"/>
+          <w:szCs w:val="18"/>
+        </w:rPr>
+        <w:t xml:space="preserve">// Su destructor se ejecuta siempre al salir del bloque: cumple el papel de finally (RAII).</w:t>
+      </w:r>
+    </w:p>
+    <w:p>
+      <w:pPr>
+        <w:shd w:fill="F2F2F2" w:color="auto" w:val="clear"/>
+        <w:spacing w:after="0" w:before="0" w:line="240"/>
+        <w:ind w:left="360"/>
+      </w:pPr>
+      <w:r>
+        <w:rPr>
+          <w:rFonts w:ascii="Consolas" w:cs="Consolas" w:eastAsia="Consolas" w:hAnsi="Consolas"/>
+          <w:sz w:val="18"/>
+          <w:szCs w:val="18"/>
+        </w:rPr>
+        <w:t xml:space="preserve">struct MensajeCierre {</w:t>
+      </w:r>
+    </w:p>
+    <w:p>
+      <w:pPr>
+        <w:shd w:fill="F2F2F2" w:color="auto" w:val="clear"/>
+        <w:spacing w:after="0" w:before="0" w:line="240"/>
+        <w:ind w:left="360"/>
+      </w:pPr>
+      <w:r>
+        <w:rPr>
+          <w:rFonts w:ascii="Consolas" w:cs="Consolas" w:eastAsia="Consolas" w:hAnsi="Consolas"/>
+          <w:sz w:val="18"/>
+          <w:szCs w:val="18"/>
+        </w:rPr>
+        <w:t xml:space="preserve">    ~MensajeCierre() { std::cout &lt;&lt; "Operación finalizada.\n"; }</w:t>
+      </w:r>
+    </w:p>
+    <w:p>
+      <w:pPr>
+        <w:shd w:fill="F2F2F2" w:color="auto" w:val="clear"/>
+        <w:spacing w:after="0" w:before="0" w:line="240"/>
+        <w:ind w:left="360"/>
+      </w:pPr>
+      <w:r>
+        <w:rPr>
+          <w:rFonts w:ascii="Consolas" w:cs="Consolas" w:eastAsia="Consolas" w:hAnsi="Consolas"/>
+          <w:sz w:val="18"/>
+          <w:szCs w:val="18"/>
+        </w:rPr>
+        <w:t xml:space="preserve">};</w:t>
+      </w:r>
+    </w:p>
+    <w:p>
+      <w:pPr>
+        <w:shd w:fill="F2F2F2" w:color="auto" w:val="clear"/>
+        <w:spacing w:after="0" w:before="0" w:line="240"/>
+        <w:ind w:left="360"/>
+      </w:pPr>
+      <w:r>
+        <w:rPr>
+          <w:rFonts w:ascii="Consolas" w:cs="Consolas" w:eastAsia="Consolas" w:hAnsi="Consolas"/>
+          <w:sz w:val="18"/>
+          <w:szCs w:val="18"/>
+        </w:rPr>
+        <w:t xml:space="preserve"> </w:t>
+      </w:r>
+    </w:p>
+    <w:p>
+      <w:pPr>
+        <w:shd w:fill="F2F2F2" w:color="auto" w:val="clear"/>
+        <w:spacing w:after="0" w:before="0" w:line="240"/>
+        <w:ind w:left="360"/>
+      </w:pPr>
+      <w:r>
+        <w:rPr>
+          <w:rFonts w:ascii="Consolas" w:cs="Consolas" w:eastAsia="Consolas" w:hAnsi="Consolas"/>
+          <w:sz w:val="18"/>
+          <w:szCs w:val="18"/>
+        </w:rPr>
+        <w:t xml:space="preserve">double dividir(double dividendo, double divisor) {</w:t>
+      </w:r>
+    </w:p>
+    <w:p>
+      <w:pPr>
+        <w:shd w:fill="F2F2F2" w:color="auto" w:val="clear"/>
+        <w:spacing w:after="0" w:before="0" w:line="240"/>
+        <w:ind w:left="360"/>
+      </w:pPr>
+      <w:r>
+        <w:rPr>
+          <w:rFonts w:ascii="Consolas" w:cs="Consolas" w:eastAsia="Consolas" w:hAnsi="Consolas"/>
+          <w:sz w:val="18"/>
+          <w:szCs w:val="18"/>
+        </w:rPr>
+        <w:t xml:space="preserve">    if (divisor == 0) {</w:t>
+      </w:r>
+    </w:p>
+    <w:p>
+      <w:pPr>
+        <w:shd w:fill="F2F2F2" w:color="auto" w:val="clear"/>
+        <w:spacing w:after="0" w:before="0" w:line="240"/>
+        <w:ind w:left="360"/>
+      </w:pPr>
+      <w:r>
+        <w:rPr>
+          <w:rFonts w:ascii="Consolas" w:cs="Consolas" w:eastAsia="Consolas" w:hAnsi="Consolas"/>
+          <w:sz w:val="18"/>
+          <w:szCs w:val="18"/>
+        </w:rPr>
+        <w:t xml:space="preserve">        throw std::domain_error("no se puede dividir entre cero");</w:t>
+      </w:r>
+    </w:p>
+    <w:p>
+      <w:pPr>
+        <w:shd w:fill="F2F2F2" w:color="auto" w:val="clear"/>
+        <w:spacing w:after="0" w:before="0" w:line="240"/>
+        <w:ind w:left="360"/>
+      </w:pPr>
+      <w:r>
+        <w:rPr>
+          <w:rFonts w:ascii="Consolas" w:cs="Consolas" w:eastAsia="Consolas" w:hAnsi="Consolas"/>
+          <w:sz w:val="18"/>
+          <w:szCs w:val="18"/>
+        </w:rPr>
+        <w:t xml:space="preserve">    }</w:t>
+      </w:r>
+    </w:p>
+    <w:p>
+      <w:pPr>
+        <w:shd w:fill="F2F2F2" w:color="auto" w:val="clear"/>
+        <w:spacing w:after="0" w:before="0" w:line="240"/>
+        <w:ind w:left="360"/>
+      </w:pPr>
+      <w:r>
+        <w:rPr>
+          <w:rFonts w:ascii="Consolas" w:cs="Consolas" w:eastAsia="Consolas" w:hAnsi="Consolas"/>
+          <w:sz w:val="18"/>
+          <w:szCs w:val="18"/>
+        </w:rPr>
+        <w:t xml:space="preserve">    return dividendo / divisor;</w:t>
+      </w:r>
+    </w:p>
+    <w:p>
+      <w:pPr>
+        <w:shd w:fill="F2F2F2" w:color="auto" w:val="clear"/>
+        <w:spacing w:after="0" w:before="0" w:line="240"/>
+        <w:ind w:left="360"/>
+      </w:pPr>
+      <w:r>
+        <w:rPr>
+          <w:rFonts w:ascii="Consolas" w:cs="Consolas" w:eastAsia="Consolas" w:hAnsi="Consolas"/>
+          <w:sz w:val="18"/>
+          <w:szCs w:val="18"/>
+        </w:rPr>
+        <w:t xml:space="preserve">}</w:t>
+      </w:r>
+    </w:p>
+    <w:p>
+      <w:pPr>
+        <w:shd w:fill="F2F2F2" w:color="auto" w:val="clear"/>
+        <w:spacing w:after="0" w:before="0" w:line="240"/>
+        <w:ind w:left="360"/>
+      </w:pPr>
+      <w:r>
+        <w:rPr>
+          <w:rFonts w:ascii="Consolas" w:cs="Consolas" w:eastAsia="Consolas" w:hAnsi="Consolas"/>
+          <w:sz w:val="18"/>
+          <w:szCs w:val="18"/>
+        </w:rPr>
+        <w:t xml:space="preserve"> </w:t>
+      </w:r>
+    </w:p>
+    <w:p>
+      <w:pPr>
+        <w:shd w:fill="F2F2F2" w:color="auto" w:val="clear"/>
+        <w:spacing w:after="0" w:before="0" w:line="240"/>
+        <w:ind w:left="360"/>
+      </w:pPr>
+      <w:r>
+        <w:rPr>
+          <w:rFonts w:ascii="Consolas" w:cs="Consolas" w:eastAsia="Consolas" w:hAnsi="Consolas"/>
+          <w:sz w:val="18"/>
+          <w:szCs w:val="18"/>
+        </w:rPr>
+        <w:t xml:space="preserve">double leerNumero(const std::string&amp; mensaje) {</w:t>
+      </w:r>
+    </w:p>
+    <w:p>
+      <w:pPr>
+        <w:shd w:fill="F2F2F2" w:color="auto" w:val="clear"/>
+        <w:spacing w:after="0" w:before="0" w:line="240"/>
+        <w:ind w:left="360"/>
+      </w:pPr>
+      <w:r>
+        <w:rPr>
+          <w:rFonts w:ascii="Consolas" w:cs="Consolas" w:eastAsia="Consolas" w:hAnsi="Consolas"/>
+          <w:sz w:val="18"/>
+          <w:szCs w:val="18"/>
+        </w:rPr>
+        <w:t xml:space="preserve">    std::cout &lt;&lt; mensaje;</w:t>
+      </w:r>
+    </w:p>
+    <w:p>
+      <w:pPr>
+        <w:shd w:fill="F2F2F2" w:color="auto" w:val="clear"/>
+        <w:spacing w:after="0" w:before="0" w:line="240"/>
+        <w:ind w:left="360"/>
+      </w:pPr>
+      <w:r>
+        <w:rPr>
+          <w:rFonts w:ascii="Consolas" w:cs="Consolas" w:eastAsia="Consolas" w:hAnsi="Consolas"/>
+          <w:sz w:val="18"/>
+          <w:szCs w:val="18"/>
+        </w:rPr>
+        <w:t xml:space="preserve">    double valor;</w:t>
+      </w:r>
+    </w:p>
+    <w:p>
+      <w:pPr>
+        <w:shd w:fill="F2F2F2" w:color="auto" w:val="clear"/>
+        <w:spacing w:after="0" w:before="0" w:line="240"/>
+        <w:ind w:left="360"/>
+      </w:pPr>
+      <w:r>
+        <w:rPr>
+          <w:rFonts w:ascii="Consolas" w:cs="Consolas" w:eastAsia="Consolas" w:hAnsi="Consolas"/>
+          <w:sz w:val="18"/>
+          <w:szCs w:val="18"/>
+        </w:rPr>
+        <w:t xml:space="preserve">    if (!(std::cin &gt;&gt; valor)) {</w:t>
+      </w:r>
+    </w:p>
+    <w:p>
+      <w:pPr>
+        <w:shd w:fill="F2F2F2" w:color="auto" w:val="clear"/>
+        <w:spacing w:after="0" w:before="0" w:line="240"/>
+        <w:ind w:left="360"/>
+      </w:pPr>
+      <w:r>
+        <w:rPr>
+          <w:rFonts w:ascii="Consolas" w:cs="Consolas" w:eastAsia="Consolas" w:hAnsi="Consolas"/>
+          <w:sz w:val="18"/>
+          <w:szCs w:val="18"/>
+        </w:rPr>
+        <w:t xml:space="preserve">        throw std::invalid_argument("debe ingresar un número válido");</w:t>
+      </w:r>
+    </w:p>
+    <w:p>
+      <w:pPr>
+        <w:shd w:fill="F2F2F2" w:color="auto" w:val="clear"/>
+        <w:spacing w:after="0" w:before="0" w:line="240"/>
+        <w:ind w:left="360"/>
+      </w:pPr>
+      <w:r>
+        <w:rPr>
+          <w:rFonts w:ascii="Consolas" w:cs="Consolas" w:eastAsia="Consolas" w:hAnsi="Consolas"/>
+          <w:sz w:val="18"/>
+          <w:szCs w:val="18"/>
+        </w:rPr>
+        <w:t xml:space="preserve">    }</w:t>
+      </w:r>
+    </w:p>
+    <w:p>
+      <w:pPr>
+        <w:shd w:fill="F2F2F2" w:color="auto" w:val="clear"/>
+        <w:spacing w:after="0" w:before="0" w:line="240"/>
+        <w:ind w:left="360"/>
+      </w:pPr>
+      <w:r>
+        <w:rPr>
+          <w:rFonts w:ascii="Consolas" w:cs="Consolas" w:eastAsia="Consolas" w:hAnsi="Consolas"/>
+          <w:sz w:val="18"/>
+          <w:szCs w:val="18"/>
+        </w:rPr>
+        <w:t xml:space="preserve">    return valor;</w:t>
+      </w:r>
+    </w:p>
+    <w:p>
+      <w:pPr>
+        <w:shd w:fill="F2F2F2" w:color="auto" w:val="clear"/>
+        <w:spacing w:after="0" w:before="0" w:line="240"/>
+        <w:ind w:left="360"/>
+      </w:pPr>
+      <w:r>
+        <w:rPr>
+          <w:rFonts w:ascii="Consolas" w:cs="Consolas" w:eastAsia="Consolas" w:hAnsi="Consolas"/>
+          <w:sz w:val="18"/>
+          <w:szCs w:val="18"/>
+        </w:rPr>
+        <w:t xml:space="preserve">}</w:t>
+      </w:r>
+    </w:p>
+    <w:p>
+      <w:pPr>
+        <w:shd w:fill="F2F2F2" w:color="auto" w:val="clear"/>
+        <w:spacing w:after="0" w:before="0" w:line="240"/>
+        <w:ind w:left="360"/>
+      </w:pPr>
+      <w:r>
+        <w:rPr>
+          <w:rFonts w:ascii="Consolas" w:cs="Consolas" w:eastAsia="Consolas" w:hAnsi="Consolas"/>
+          <w:sz w:val="18"/>
+          <w:szCs w:val="18"/>
+        </w:rPr>
+        <w:t xml:space="preserve"> </w:t>
+      </w:r>
+    </w:p>
+    <w:p>
+      <w:pPr>
+        <w:shd w:fill="F2F2F2" w:color="auto" w:val="clear"/>
+        <w:spacing w:after="0" w:before="0" w:line="240"/>
+        <w:ind w:left="360"/>
+      </w:pPr>
+      <w:r>
+        <w:rPr>
+          <w:rFonts w:ascii="Consolas" w:cs="Consolas" w:eastAsia="Consolas" w:hAnsi="Consolas"/>
+          <w:sz w:val="18"/>
+          <w:szCs w:val="18"/>
+        </w:rPr>
+        <w:t xml:space="preserve">int main() {</w:t>
+      </w:r>
+    </w:p>
+    <w:p>
+      <w:pPr>
+        <w:shd w:fill="F2F2F2" w:color="auto" w:val="clear"/>
+        <w:spacing w:after="0" w:before="0" w:line="240"/>
+        <w:ind w:left="360"/>
+      </w:pPr>
+      <w:r>
+        <w:rPr>
+          <w:rFonts w:ascii="Consolas" w:cs="Consolas" w:eastAsia="Consolas" w:hAnsi="Consolas"/>
+          <w:sz w:val="18"/>
+          <w:szCs w:val="18"/>
+        </w:rPr>
+        <w:t xml:space="preserve">    std::cout &lt;&lt; "===== DIVISIÓN SEGURA =====\n";</w:t>
+      </w:r>
+    </w:p>
+    <w:p>
+      <w:pPr>
+        <w:shd w:fill="F2F2F2" w:color="auto" w:val="clear"/>
+        <w:spacing w:after="0" w:before="0" w:line="240"/>
+        <w:ind w:left="360"/>
+      </w:pPr>
+      <w:r>
+        <w:rPr>
+          <w:rFonts w:ascii="Consolas" w:cs="Consolas" w:eastAsia="Consolas" w:hAnsi="Consolas"/>
+          <w:sz w:val="18"/>
+          <w:szCs w:val="18"/>
+        </w:rPr>
+        <w:t xml:space="preserve">    {</w:t>
+      </w:r>
+    </w:p>
+    <w:p>
+      <w:pPr>
+        <w:shd w:fill="F2F2F2" w:color="auto" w:val="clear"/>
+        <w:spacing w:after="0" w:before="0" w:line="240"/>
+        <w:ind w:left="360"/>
+      </w:pPr>
+      <w:r>
+        <w:rPr>
+          <w:rFonts w:ascii="Consolas" w:cs="Consolas" w:eastAsia="Consolas" w:hAnsi="Consolas"/>
+          <w:sz w:val="18"/>
+          <w:szCs w:val="18"/>
+        </w:rPr>
+        <w:t xml:space="preserve">        MensajeCierre cierre;</w:t>
+      </w:r>
+    </w:p>
+    <w:p>
+      <w:pPr>
+        <w:shd w:fill="F2F2F2" w:color="auto" w:val="clear"/>
+        <w:spacing w:after="0" w:before="0" w:line="240"/>
+        <w:ind w:left="360"/>
+      </w:pPr>
+      <w:r>
+        <w:rPr>
+          <w:rFonts w:ascii="Consolas" w:cs="Consolas" w:eastAsia="Consolas" w:hAnsi="Consolas"/>
+          <w:sz w:val="18"/>
+          <w:szCs w:val="18"/>
+        </w:rPr>
+        <w:t xml:space="preserve">        try {</w:t>
+      </w:r>
+    </w:p>
+    <w:p>
+      <w:pPr>
+        <w:shd w:fill="F2F2F2" w:color="auto" w:val="clear"/>
+        <w:spacing w:after="0" w:before="0" w:line="240"/>
+        <w:ind w:left="360"/>
+      </w:pPr>
+      <w:r>
+        <w:rPr>
+          <w:rFonts w:ascii="Consolas" w:cs="Consolas" w:eastAsia="Consolas" w:hAnsi="Consolas"/>
+          <w:sz w:val="18"/>
+          <w:szCs w:val="18"/>
+        </w:rPr>
+        <w:t xml:space="preserve">            double dividendo = leerNumero("Ingrese el dividendo: ");</w:t>
+      </w:r>
+    </w:p>
+    <w:p>
+      <w:pPr>
+        <w:shd w:fill="F2F2F2" w:color="auto" w:val="clear"/>
+        <w:spacing w:after="0" w:before="0" w:line="240"/>
+        <w:ind w:left="360"/>
+      </w:pPr>
+      <w:r>
+        <w:rPr>
+          <w:rFonts w:ascii="Consolas" w:cs="Consolas" w:eastAsia="Consolas" w:hAnsi="Consolas"/>
+          <w:sz w:val="18"/>
+          <w:szCs w:val="18"/>
+        </w:rPr>
+        <w:t xml:space="preserve">            double divisor = leerNumero("Ingrese el divisor: ");</w:t>
+      </w:r>
+    </w:p>
+    <w:p>
+      <w:pPr>
+        <w:shd w:fill="F2F2F2" w:color="auto" w:val="clear"/>
+        <w:spacing w:after="0" w:before="0" w:line="240"/>
+        <w:ind w:left="360"/>
+      </w:pPr>
+      <w:r>
+        <w:rPr>
+          <w:rFonts w:ascii="Consolas" w:cs="Consolas" w:eastAsia="Consolas" w:hAnsi="Consolas"/>
+          <w:sz w:val="18"/>
+          <w:szCs w:val="18"/>
+        </w:rPr>
+        <w:t xml:space="preserve">            double resultado = dividir(dividendo, divisor);</w:t>
+      </w:r>
+    </w:p>
+    <w:p>
+      <w:pPr>
+        <w:shd w:fill="F2F2F2" w:color="auto" w:val="clear"/>
+        <w:spacing w:after="0" w:before="0" w:line="240"/>
+        <w:ind w:left="360"/>
+      </w:pPr>
+      <w:r>
+        <w:rPr>
+          <w:rFonts w:ascii="Consolas" w:cs="Consolas" w:eastAsia="Consolas" w:hAnsi="Consolas"/>
+          <w:sz w:val="18"/>
+          <w:szCs w:val="18"/>
+        </w:rPr>
+        <w:t xml:space="preserve">            std::cout &lt;&lt; "Resultado: " &lt;&lt; resultado &lt;&lt; '\n';</w:t>
+      </w:r>
+    </w:p>
+    <w:p>
+      <w:pPr>
+        <w:shd w:fill="F2F2F2" w:color="auto" w:val="clear"/>
+        <w:spacing w:after="0" w:before="0" w:line="240"/>
+        <w:ind w:left="360"/>
+      </w:pPr>
+      <w:r>
+        <w:rPr>
+          <w:rFonts w:ascii="Consolas" w:cs="Consolas" w:eastAsia="Consolas" w:hAnsi="Consolas"/>
+          <w:sz w:val="18"/>
+          <w:szCs w:val="18"/>
+        </w:rPr>
+        <w:t xml:space="preserve">        } catch (const std::domain_error&amp; e) {</w:t>
+      </w:r>
+    </w:p>
+    <w:p>
+      <w:pPr>
+        <w:shd w:fill="F2F2F2" w:color="auto" w:val="clear"/>
+        <w:spacing w:after="0" w:before="0" w:line="240"/>
+        <w:ind w:left="360"/>
+      </w:pPr>
+      <w:r>
+        <w:rPr>
+          <w:rFonts w:ascii="Consolas" w:cs="Consolas" w:eastAsia="Consolas" w:hAnsi="Consolas"/>
+          <w:sz w:val="18"/>
+          <w:szCs w:val="18"/>
+        </w:rPr>
+        <w:t xml:space="preserve">            std::cout &lt;&lt; "Error: " &lt;&lt; e.what() &lt;&lt; ".\n";</w:t>
+      </w:r>
+    </w:p>
+    <w:p>
+      <w:pPr>
+        <w:shd w:fill="F2F2F2" w:color="auto" w:val="clear"/>
+        <w:spacing w:after="0" w:before="0" w:line="240"/>
+        <w:ind w:left="360"/>
+      </w:pPr>
+      <w:r>
+        <w:rPr>
+          <w:rFonts w:ascii="Consolas" w:cs="Consolas" w:eastAsia="Consolas" w:hAnsi="Consolas"/>
+          <w:sz w:val="18"/>
+          <w:szCs w:val="18"/>
+        </w:rPr>
+        <w:t xml:space="preserve">        } catch (const std::invalid_argument&amp; e) {</w:t>
+      </w:r>
+    </w:p>
+    <w:p>
+      <w:pPr>
+        <w:shd w:fill="F2F2F2" w:color="auto" w:val="clear"/>
+        <w:spacing w:after="0" w:before="0" w:line="240"/>
+        <w:ind w:left="360"/>
+      </w:pPr>
+      <w:r>
+        <w:rPr>
+          <w:rFonts w:ascii="Consolas" w:cs="Consolas" w:eastAsia="Consolas" w:hAnsi="Consolas"/>
+          <w:sz w:val="18"/>
+          <w:szCs w:val="18"/>
+        </w:rPr>
+        <w:t xml:space="preserve">            std::cout &lt;&lt; "Error: " &lt;&lt; e.what() &lt;&lt; ".\n";</w:t>
+      </w:r>
+    </w:p>
+    <w:p>
+      <w:pPr>
+        <w:shd w:fill="F2F2F2" w:color="auto" w:val="clear"/>
+        <w:spacing w:after="0" w:before="0" w:line="240"/>
+        <w:ind w:left="360"/>
+      </w:pPr>
+      <w:r>
+        <w:rPr>
+          <w:rFonts w:ascii="Consolas" w:cs="Consolas" w:eastAsia="Consolas" w:hAnsi="Consolas"/>
+          <w:sz w:val="18"/>
+          <w:szCs w:val="18"/>
+        </w:rPr>
+        <w:t xml:space="preserve">        }</w:t>
+      </w:r>
+    </w:p>
+    <w:p>
+      <w:pPr>
+        <w:shd w:fill="F2F2F2" w:color="auto" w:val="clear"/>
+        <w:spacing w:after="0" w:before="0" w:line="240"/>
+        <w:ind w:left="360"/>
+      </w:pPr>
+      <w:r>
+        <w:rPr>
+          <w:rFonts w:ascii="Consolas" w:cs="Consolas" w:eastAsia="Consolas" w:hAnsi="Consolas"/>
+          <w:sz w:val="18"/>
+          <w:szCs w:val="18"/>
+        </w:rPr>
+        <w:t xml:space="preserve">    }  // aquí se destruye `cierre` y se muestra el mensaje de cierre</w:t>
+      </w:r>
+    </w:p>
+    <w:p>
+      <w:pPr>
+        <w:shd w:fill="F2F2F2" w:color="auto" w:val="clear"/>
+        <w:spacing w:after="0" w:before="0" w:line="240"/>
+        <w:ind w:left="360"/>
+      </w:pPr>
+      <w:r>
+        <w:rPr>
+          <w:rFonts w:ascii="Consolas" w:cs="Consolas" w:eastAsia="Consolas" w:hAnsi="Consolas"/>
+          <w:sz w:val="18"/>
+          <w:szCs w:val="18"/>
+        </w:rPr>
+        <w:t xml:space="preserve">    return 0;</w:t>
+      </w:r>
+    </w:p>
+    <w:p>
+      <w:pPr>
+        <w:shd w:fill="F2F2F2" w:color="auto" w:val="clear"/>
+        <w:spacing w:after="240" w:before="0" w:line="240"/>
+        <w:ind w:left="360"/>
+      </w:pPr>
+      <w:r>
+        <w:rPr>
+          <w:rFonts w:ascii="Consolas" w:cs="Consolas" w:eastAsia="Consolas" w:hAnsi="Consolas"/>
+          <w:sz w:val="18"/>
+          <w:szCs w:val="18"/>
+        </w:rPr>
+        <w:t xml:space="preserve">}</w:t>
       </w:r>
     </w:p>
     <w:p>
@@ -3053,21 +3686,48 @@
     </w:p>
     <w:p>
       <w:pPr>
-        <w:pBdr>
-          <w:top w:val="dashed" w:color="999999" w:sz="6" w:space="8"/>
-          <w:left w:val="dashed" w:color="999999" w:sz="6" w:space="8"/>
-          <w:bottom w:val="dashed" w:color="999999" w:sz="6" w:space="8"/>
-          <w:right w:val="dashed" w:color="999999" w:sz="6" w:space="8"/>
-        </w:pBdr>
         <w:spacing w:after="120" w:before="120"/>
         <w:jc w:val="center"/>
       </w:pPr>
       <w:r>
-        <w:rPr>
-          <w:rFonts w:ascii="Times New Roman" w:cs="Times New Roman" w:eastAsia="Times New Roman" w:hAnsi="Times New Roman"/>
-          <w:highlight w:val="yellow"/>
-        </w:rPr>
-        <w:t xml:space="preserve">[Insertar captura: 10 / 2 muestra el resultado y «Operación finalizada.»]</w:t>
+        <w:drawing>
+          <wp:inline distT="0" distB="0" distL="0" distR="0">
+            <wp:extent cx="5486400" cy="1190625"/>
+            <wp:effectExtent t="0" r="0" b="0" l="0"/>
+            <wp:docPr id="2" name=""/>
+            <wp:cNvGraphicFramePr>
+              <a:graphicFrameLocks xmlns:a="http://schemas.openxmlformats.org/drawingml/2006/main" noChangeAspect="1"/>
+            </wp:cNvGraphicFramePr>
+            <a:graphic xmlns:a="http://schemas.openxmlformats.org/drawingml/2006/main">
+              <a:graphicData uri="http://schemas.openxmlformats.org/drawingml/2006/picture">
+                <pic:pic xmlns:pic="http://schemas.openxmlformats.org/drawingml/2006/picture">
+                  <pic:nvPicPr>
+                    <pic:cNvPr id="0" name="" descr=""/>
+                    <pic:cNvPicPr>
+                      <a:picLocks noChangeAspect="1" noChangeArrowheads="1"/>
+                    </pic:cNvPicPr>
+                  </pic:nvPicPr>
+                  <pic:blipFill>
+                    <a:blip r:embed="rId12" cstate="none"/>
+                    <a:srcRect/>
+                    <a:stretch>
+                      <a:fillRect/>
+                    </a:stretch>
+                  </pic:blipFill>
+                  <pic:spPr bwMode="auto">
+                    <a:xfrm>
+                      <a:off x="0" y="0"/>
+                      <a:ext cx="5486400" cy="1190625"/>
+                    </a:xfrm>
+                    <a:prstGeom prst="rect">
+                      <a:avLst/>
+                    </a:prstGeom>
+                  </pic:spPr>
+                </pic:pic>
+              </a:graphicData>
+            </a:graphic>
+          </wp:inline>
+        </w:drawing>
       </w:r>
     </w:p>
     <w:p>
@@ -3117,21 +3777,139 @@
     </w:p>
     <w:p>
       <w:pPr>
-        <w:pBdr>
-          <w:top w:val="dashed" w:color="999999" w:sz="6" w:space="8"/>
-          <w:left w:val="dashed" w:color="999999" w:sz="6" w:space="8"/>
-          <w:bottom w:val="dashed" w:color="999999" w:sz="6" w:space="8"/>
-          <w:right w:val="dashed" w:color="999999" w:sz="6" w:space="8"/>
-        </w:pBdr>
         <w:spacing w:after="120" w:before="120"/>
         <w:jc w:val="center"/>
       </w:pPr>
       <w:r>
-        <w:rPr>
-          <w:rFonts w:ascii="Times New Roman" w:cs="Times New Roman" w:eastAsia="Times New Roman" w:hAnsi="Times New Roman"/>
-          <w:highlight w:val="yellow"/>
-        </w:rPr>
-        <w:t xml:space="preserve">[Insertar captura: 10 / 0 muestra el mensaje de error y «Operación finalizada.»]</w:t>
+        <w:drawing>
+          <wp:inline distT="0" distB="0" distL="0" distR="0">
+            <wp:extent cx="5486400" cy="1190625"/>
+            <wp:effectExtent t="0" r="0" b="0" l="0"/>
+            <wp:docPr id="3" name=""/>
+            <wp:cNvGraphicFramePr>
+              <a:graphicFrameLocks xmlns:a="http://schemas.openxmlformats.org/drawingml/2006/main" noChangeAspect="1"/>
+            </wp:cNvGraphicFramePr>
+            <a:graphic xmlns:a="http://schemas.openxmlformats.org/drawingml/2006/main">
+              <a:graphicData uri="http://schemas.openxmlformats.org/drawingml/2006/picture">
+                <pic:pic xmlns:pic="http://schemas.openxmlformats.org/drawingml/2006/picture">
+                  <pic:nvPicPr>
+                    <pic:cNvPr id="0" name="" descr=""/>
+                    <pic:cNvPicPr>
+                      <a:picLocks noChangeAspect="1" noChangeArrowheads="1"/>
+                    </pic:cNvPicPr>
+                  </pic:nvPicPr>
+                  <pic:blipFill>
+                    <a:blip r:embed="rId13" cstate="none"/>
+                    <a:srcRect/>
+                    <a:stretch>
+                      <a:fillRect/>
+                    </a:stretch>
+                  </pic:blipFill>
+                  <pic:spPr bwMode="auto">
+                    <a:xfrm>
+                      <a:off x="0" y="0"/>
+                      <a:ext cx="5486400" cy="1190625"/>
+                    </a:xfrm>
+                    <a:prstGeom prst="rect">
+                      <a:avLst/>
+                    </a:prstGeom>
+                  </pic:spPr>
+                </pic:pic>
+              </a:graphicData>
+            </a:graphic>
+          </wp:inline>
+        </w:drawing>
+      </w:r>
+    </w:p>
+    <w:p>
+      <w:pPr>
+        <w:spacing w:after="240" w:before="120" w:line="480"/>
+      </w:pPr>
+      <w:r>
+        <w:rPr>
+          <w:rFonts w:ascii="Times New Roman" w:cs="Times New Roman" w:eastAsia="Times New Roman" w:hAnsi="Times New Roman"/>
+          <w:i/>
+          <w:iCs/>
+        </w:rPr>
+        <w:t xml:space="preserve">Nota. </w:t>
+      </w:r>
+      <w:r>
+        <w:rPr>
+          <w:rFonts w:ascii="Times New Roman" w:cs="Times New Roman" w:eastAsia="Times New Roman" w:hAnsi="Times New Roman"/>
+        </w:rPr>
+        <w:t xml:space="preserve">Elaboración propia.</w:t>
+      </w:r>
+    </w:p>
+    <w:p>
+      <w:pPr>
+        <w:spacing w:before="240" w:line="480"/>
+      </w:pPr>
+      <w:r>
+        <w:rPr>
+          <w:rFonts w:ascii="Times New Roman" w:cs="Times New Roman" w:eastAsia="Times New Roman" w:hAnsi="Times New Roman"/>
+          <w:b/>
+          <w:bCs/>
+        </w:rPr>
+        <w:t xml:space="preserve">Figura 3</w:t>
+      </w:r>
+    </w:p>
+    <w:p>
+      <w:pPr>
+        <w:spacing w:line="480"/>
+      </w:pPr>
+      <w:r>
+        <w:rPr>
+          <w:rFonts w:ascii="Times New Roman" w:cs="Times New Roman" w:eastAsia="Times New Roman" w:hAnsi="Times New Roman"/>
+          <w:i/>
+          <w:iCs/>
+        </w:rPr>
+        <w:t xml:space="preserve">Ejecución de la Práctica 1 con un dato no numérico</w:t>
+      </w:r>
+    </w:p>
+    <w:p>
+      <w:pPr>
+        <w:spacing w:after="120" w:before="120"/>
+        <w:jc w:val="center"/>
+      </w:pPr>
+      <w:r>
+        <w:drawing>
+          <wp:inline distT="0" distB="0" distL="0" distR="0">
+            <wp:extent cx="5486400" cy="1076325"/>
+            <wp:effectExtent t="0" r="0" b="0" l="0"/>
+            <wp:docPr id="4" name=""/>
+            <wp:cNvGraphicFramePr>
+              <a:graphicFrameLocks xmlns:a="http://schemas.openxmlformats.org/drawingml/2006/main" noChangeAspect="1"/>
+            </wp:cNvGraphicFramePr>
+            <a:graphic xmlns:a="http://schemas.openxmlformats.org/drawingml/2006/main">
+              <a:graphicData uri="http://schemas.openxmlformats.org/drawingml/2006/picture">
+                <pic:pic xmlns:pic="http://schemas.openxmlformats.org/drawingml/2006/picture">
+                  <pic:nvPicPr>
+                    <pic:cNvPr id="0" name="" descr=""/>
+                    <pic:cNvPicPr>
+                      <a:picLocks noChangeAspect="1" noChangeArrowheads="1"/>
+                    </pic:cNvPicPr>
+                  </pic:nvPicPr>
+                  <pic:blipFill>
+                    <a:blip r:embed="rId14" cstate="none"/>
+                    <a:srcRect/>
+                    <a:stretch>
+                      <a:fillRect/>
+                    </a:stretch>
+                  </pic:blipFill>
+                  <pic:spPr bwMode="auto">
+                    <a:xfrm>
+                      <a:off x="0" y="0"/>
+                      <a:ext cx="5486400" cy="1076325"/>
+                    </a:xfrm>
+                    <a:prstGeom prst="rect">
+                      <a:avLst/>
+                    </a:prstGeom>
+                  </pic:spPr>
+                </pic:pic>
+              </a:graphicData>
+            </a:graphic>
+          </wp:inline>
+        </w:drawing>
       </w:r>
     </w:p>
     <w:p>
@@ -4022,6 +4800,1197 @@
           <w:szCs w:val="18"/>
         </w:rPr>
         <w:t xml:space="preserve">    registrarError(std::string("Inesperado: ") + e.what());</w:t>
+      </w:r>
+    </w:p>
+    <w:p>
+      <w:pPr>
+        <w:shd w:fill="F2F2F2" w:color="auto" w:val="clear"/>
+        <w:spacing w:after="240" w:before="0" w:line="240"/>
+        <w:ind w:left="360"/>
+      </w:pPr>
+      <w:r>
+        <w:rPr>
+          <w:rFonts w:ascii="Consolas" w:cs="Consolas" w:eastAsia="Consolas" w:hAnsi="Consolas"/>
+          <w:sz w:val="18"/>
+          <w:szCs w:val="18"/>
+        </w:rPr>
+        <w:t xml:space="preserve">}</w:t>
+      </w:r>
+    </w:p>
+    <w:p>
+      <w:pPr>
+        <w:spacing w:line="480"/>
+        <w:ind w:firstLine="720"/>
+      </w:pPr>
+      <w:r>
+        <w:rPr>
+          <w:rFonts w:ascii="Times New Roman" w:cs="Times New Roman" w:eastAsia="Times New Roman" w:hAnsi="Times New Roman"/>
+        </w:rPr>
+        <w:t xml:space="preserve">Las excepciones personalizadas construyen en su constructor un mensaje claro para el usuario a partir de los datos del error:</w:t>
+      </w:r>
+    </w:p>
+    <w:p>
+      <w:pPr>
+        <w:shd w:fill="F2F2F2" w:color="auto" w:val="clear"/>
+        <w:spacing w:after="0" w:before="120" w:line="240"/>
+        <w:ind w:left="360"/>
+      </w:pPr>
+      <w:r>
+        <w:rPr>
+          <w:rFonts w:ascii="Consolas" w:cs="Consolas" w:eastAsia="Consolas" w:hAnsi="Consolas"/>
+          <w:sz w:val="18"/>
+          <w:szCs w:val="18"/>
+        </w:rPr>
+        <w:t xml:space="preserve">#include "excepciones.h"</w:t>
+      </w:r>
+    </w:p>
+    <w:p>
+      <w:pPr>
+        <w:shd w:fill="F2F2F2" w:color="auto" w:val="clear"/>
+        <w:spacing w:after="0" w:before="0" w:line="240"/>
+        <w:ind w:left="360"/>
+      </w:pPr>
+      <w:r>
+        <w:rPr>
+          <w:rFonts w:ascii="Consolas" w:cs="Consolas" w:eastAsia="Consolas" w:hAnsi="Consolas"/>
+          <w:sz w:val="18"/>
+          <w:szCs w:val="18"/>
+        </w:rPr>
+        <w:t xml:space="preserve"> </w:t>
+      </w:r>
+    </w:p>
+    <w:p>
+      <w:pPr>
+        <w:shd w:fill="F2F2F2" w:color="auto" w:val="clear"/>
+        <w:spacing w:after="0" w:before="0" w:line="240"/>
+        <w:ind w:left="360"/>
+      </w:pPr>
+      <w:r>
+        <w:rPr>
+          <w:rFonts w:ascii="Consolas" w:cs="Consolas" w:eastAsia="Consolas" w:hAnsi="Consolas"/>
+          <w:sz w:val="18"/>
+          <w:szCs w:val="18"/>
+        </w:rPr>
+        <w:t xml:space="preserve">RegistroException::RegistroException(const std::string&amp; mensaje)</w:t>
+      </w:r>
+    </w:p>
+    <w:p>
+      <w:pPr>
+        <w:shd w:fill="F2F2F2" w:color="auto" w:val="clear"/>
+        <w:spacing w:after="0" w:before="0" w:line="240"/>
+        <w:ind w:left="360"/>
+      </w:pPr>
+      <w:r>
+        <w:rPr>
+          <w:rFonts w:ascii="Consolas" w:cs="Consolas" w:eastAsia="Consolas" w:hAnsi="Consolas"/>
+          <w:sz w:val="18"/>
+          <w:szCs w:val="18"/>
+        </w:rPr>
+        <w:t xml:space="preserve">    : std::runtime_error(mensaje) {}</w:t>
+      </w:r>
+    </w:p>
+    <w:p>
+      <w:pPr>
+        <w:shd w:fill="F2F2F2" w:color="auto" w:val="clear"/>
+        <w:spacing w:after="0" w:before="0" w:line="240"/>
+        <w:ind w:left="360"/>
+      </w:pPr>
+      <w:r>
+        <w:rPr>
+          <w:rFonts w:ascii="Consolas" w:cs="Consolas" w:eastAsia="Consolas" w:hAnsi="Consolas"/>
+          <w:sz w:val="18"/>
+          <w:szCs w:val="18"/>
+        </w:rPr>
+        <w:t xml:space="preserve"> </w:t>
+      </w:r>
+    </w:p>
+    <w:p>
+      <w:pPr>
+        <w:shd w:fill="F2F2F2" w:color="auto" w:val="clear"/>
+        <w:spacing w:after="0" w:before="0" w:line="240"/>
+        <w:ind w:left="360"/>
+      </w:pPr>
+      <w:r>
+        <w:rPr>
+          <w:rFonts w:ascii="Consolas" w:cs="Consolas" w:eastAsia="Consolas" w:hAnsi="Consolas"/>
+          <w:sz w:val="18"/>
+          <w:szCs w:val="18"/>
+        </w:rPr>
+        <w:t xml:space="preserve">EntradaInvalidaException::EntradaInvalidaException(const std::string&amp; campo, const std::string&amp; detalle)</w:t>
+      </w:r>
+    </w:p>
+    <w:p>
+      <w:pPr>
+        <w:shd w:fill="F2F2F2" w:color="auto" w:val="clear"/>
+        <w:spacing w:after="0" w:before="0" w:line="240"/>
+        <w:ind w:left="360"/>
+      </w:pPr>
+      <w:r>
+        <w:rPr>
+          <w:rFonts w:ascii="Consolas" w:cs="Consolas" w:eastAsia="Consolas" w:hAnsi="Consolas"/>
+          <w:sz w:val="18"/>
+          <w:szCs w:val="18"/>
+        </w:rPr>
+        <w:t xml:space="preserve">    : RegistroException(campo + ": " + detalle), campo_(campo) {}</w:t>
+      </w:r>
+    </w:p>
+    <w:p>
+      <w:pPr>
+        <w:shd w:fill="F2F2F2" w:color="auto" w:val="clear"/>
+        <w:spacing w:after="0" w:before="0" w:line="240"/>
+        <w:ind w:left="360"/>
+      </w:pPr>
+      <w:r>
+        <w:rPr>
+          <w:rFonts w:ascii="Consolas" w:cs="Consolas" w:eastAsia="Consolas" w:hAnsi="Consolas"/>
+          <w:sz w:val="18"/>
+          <w:szCs w:val="18"/>
+        </w:rPr>
+        <w:t xml:space="preserve"> </w:t>
+      </w:r>
+    </w:p>
+    <w:p>
+      <w:pPr>
+        <w:shd w:fill="F2F2F2" w:color="auto" w:val="clear"/>
+        <w:spacing w:after="0" w:before="0" w:line="240"/>
+        <w:ind w:left="360"/>
+      </w:pPr>
+      <w:r>
+        <w:rPr>
+          <w:rFonts w:ascii="Consolas" w:cs="Consolas" w:eastAsia="Consolas" w:hAnsi="Consolas"/>
+          <w:sz w:val="18"/>
+          <w:szCs w:val="18"/>
+        </w:rPr>
+        <w:t xml:space="preserve">const std::string&amp; EntradaInvalidaException::campo() const { return campo_; }</w:t>
+      </w:r>
+    </w:p>
+    <w:p>
+      <w:pPr>
+        <w:shd w:fill="F2F2F2" w:color="auto" w:val="clear"/>
+        <w:spacing w:after="0" w:before="0" w:line="240"/>
+        <w:ind w:left="360"/>
+      </w:pPr>
+      <w:r>
+        <w:rPr>
+          <w:rFonts w:ascii="Consolas" w:cs="Consolas" w:eastAsia="Consolas" w:hAnsi="Consolas"/>
+          <w:sz w:val="18"/>
+          <w:szCs w:val="18"/>
+        </w:rPr>
+        <w:t xml:space="preserve"> </w:t>
+      </w:r>
+    </w:p>
+    <w:p>
+      <w:pPr>
+        <w:shd w:fill="F2F2F2" w:color="auto" w:val="clear"/>
+        <w:spacing w:after="0" w:before="0" w:line="240"/>
+        <w:ind w:left="360"/>
+      </w:pPr>
+      <w:r>
+        <w:rPr>
+          <w:rFonts w:ascii="Consolas" w:cs="Consolas" w:eastAsia="Consolas" w:hAnsi="Consolas"/>
+          <w:sz w:val="18"/>
+          <w:szCs w:val="18"/>
+        </w:rPr>
+        <w:t xml:space="preserve">ArchivoNoEncontradoException::ArchivoNoEncontradoException(const std::string&amp; ruta)</w:t>
+      </w:r>
+    </w:p>
+    <w:p>
+      <w:pPr>
+        <w:shd w:fill="F2F2F2" w:color="auto" w:val="clear"/>
+        <w:spacing w:after="0" w:before="0" w:line="240"/>
+        <w:ind w:left="360"/>
+      </w:pPr>
+      <w:r>
+        <w:rPr>
+          <w:rFonts w:ascii="Consolas" w:cs="Consolas" w:eastAsia="Consolas" w:hAnsi="Consolas"/>
+          <w:sz w:val="18"/>
+          <w:szCs w:val="18"/>
+        </w:rPr>
+        <w:t xml:space="preserve">    : RegistroException("No se encontró el archivo " + ruta) {}</w:t>
+      </w:r>
+    </w:p>
+    <w:p>
+      <w:pPr>
+        <w:shd w:fill="F2F2F2" w:color="auto" w:val="clear"/>
+        <w:spacing w:after="0" w:before="0" w:line="240"/>
+        <w:ind w:left="360"/>
+      </w:pPr>
+      <w:r>
+        <w:rPr>
+          <w:rFonts w:ascii="Consolas" w:cs="Consolas" w:eastAsia="Consolas" w:hAnsi="Consolas"/>
+          <w:sz w:val="18"/>
+          <w:szCs w:val="18"/>
+        </w:rPr>
+        <w:t xml:space="preserve"> </w:t>
+      </w:r>
+    </w:p>
+    <w:p>
+      <w:pPr>
+        <w:shd w:fill="F2F2F2" w:color="auto" w:val="clear"/>
+        <w:spacing w:after="0" w:before="0" w:line="240"/>
+        <w:ind w:left="360"/>
+      </w:pPr>
+      <w:r>
+        <w:rPr>
+          <w:rFonts w:ascii="Consolas" w:cs="Consolas" w:eastAsia="Consolas" w:hAnsi="Consolas"/>
+          <w:sz w:val="18"/>
+          <w:szCs w:val="18"/>
+        </w:rPr>
+        <w:t xml:space="preserve">ArchivoCorruptoException::ArchivoCorruptoException(const std::string&amp; ruta, int linea, const std::string&amp; detalle)</w:t>
+      </w:r>
+    </w:p>
+    <w:p>
+      <w:pPr>
+        <w:shd w:fill="F2F2F2" w:color="auto" w:val="clear"/>
+        <w:spacing w:after="0" w:before="0" w:line="240"/>
+        <w:ind w:left="360"/>
+      </w:pPr>
+      <w:r>
+        <w:rPr>
+          <w:rFonts w:ascii="Consolas" w:cs="Consolas" w:eastAsia="Consolas" w:hAnsi="Consolas"/>
+          <w:sz w:val="18"/>
+          <w:szCs w:val="18"/>
+        </w:rPr>
+        <w:t xml:space="preserve">    : RegistroException("El archivo " + ruta + " está dañado en la línea " + std::to_string(linea) + ": " + detalle),</w:t>
+      </w:r>
+    </w:p>
+    <w:p>
+      <w:pPr>
+        <w:shd w:fill="F2F2F2" w:color="auto" w:val="clear"/>
+        <w:spacing w:after="0" w:before="0" w:line="240"/>
+        <w:ind w:left="360"/>
+      </w:pPr>
+      <w:r>
+        <w:rPr>
+          <w:rFonts w:ascii="Consolas" w:cs="Consolas" w:eastAsia="Consolas" w:hAnsi="Consolas"/>
+          <w:sz w:val="18"/>
+          <w:szCs w:val="18"/>
+        </w:rPr>
+        <w:t xml:space="preserve">      linea_(linea) {}</w:t>
+      </w:r>
+    </w:p>
+    <w:p>
+      <w:pPr>
+        <w:shd w:fill="F2F2F2" w:color="auto" w:val="clear"/>
+        <w:spacing w:after="0" w:before="0" w:line="240"/>
+        <w:ind w:left="360"/>
+      </w:pPr>
+      <w:r>
+        <w:rPr>
+          <w:rFonts w:ascii="Consolas" w:cs="Consolas" w:eastAsia="Consolas" w:hAnsi="Consolas"/>
+          <w:sz w:val="18"/>
+          <w:szCs w:val="18"/>
+        </w:rPr>
+        <w:t xml:space="preserve"> </w:t>
+      </w:r>
+    </w:p>
+    <w:p>
+      <w:pPr>
+        <w:shd w:fill="F2F2F2" w:color="auto" w:val="clear"/>
+        <w:spacing w:after="0" w:before="0" w:line="240"/>
+        <w:ind w:left="360"/>
+      </w:pPr>
+      <w:r>
+        <w:rPr>
+          <w:rFonts w:ascii="Consolas" w:cs="Consolas" w:eastAsia="Consolas" w:hAnsi="Consolas"/>
+          <w:sz w:val="18"/>
+          <w:szCs w:val="18"/>
+        </w:rPr>
+        <w:t xml:space="preserve">int ArchivoCorruptoException::linea() const { return linea_; }</w:t>
+      </w:r>
+    </w:p>
+    <w:p>
+      <w:pPr>
+        <w:shd w:fill="F2F2F2" w:color="auto" w:val="clear"/>
+        <w:spacing w:after="0" w:before="0" w:line="240"/>
+        <w:ind w:left="360"/>
+      </w:pPr>
+      <w:r>
+        <w:rPr>
+          <w:rFonts w:ascii="Consolas" w:cs="Consolas" w:eastAsia="Consolas" w:hAnsi="Consolas"/>
+          <w:sz w:val="18"/>
+          <w:szCs w:val="18"/>
+        </w:rPr>
+        <w:t xml:space="preserve"> </w:t>
+      </w:r>
+    </w:p>
+    <w:p>
+      <w:pPr>
+        <w:shd w:fill="F2F2F2" w:color="auto" w:val="clear"/>
+        <w:spacing w:after="0" w:before="0" w:line="240"/>
+        <w:ind w:left="360"/>
+      </w:pPr>
+      <w:r>
+        <w:rPr>
+          <w:rFonts w:ascii="Consolas" w:cs="Consolas" w:eastAsia="Consolas" w:hAnsi="Consolas"/>
+          <w:sz w:val="18"/>
+          <w:szCs w:val="18"/>
+        </w:rPr>
+        <w:t xml:space="preserve">AlumnoNoEncontradoException::AlumnoNoEncontradoException(const std::string&amp; codigo)</w:t>
+      </w:r>
+    </w:p>
+    <w:p>
+      <w:pPr>
+        <w:shd w:fill="F2F2F2" w:color="auto" w:val="clear"/>
+        <w:spacing w:after="0" w:before="0" w:line="240"/>
+        <w:ind w:left="360"/>
+      </w:pPr>
+      <w:r>
+        <w:rPr>
+          <w:rFonts w:ascii="Consolas" w:cs="Consolas" w:eastAsia="Consolas" w:hAnsi="Consolas"/>
+          <w:sz w:val="18"/>
+          <w:szCs w:val="18"/>
+        </w:rPr>
+        <w:t xml:space="preserve">    : RegistroException("No existe un alumno con el código " + codigo) {}</w:t>
+      </w:r>
+    </w:p>
+    <w:p>
+      <w:pPr>
+        <w:shd w:fill="F2F2F2" w:color="auto" w:val="clear"/>
+        <w:spacing w:after="0" w:before="0" w:line="240"/>
+        <w:ind w:left="360"/>
+      </w:pPr>
+      <w:r>
+        <w:rPr>
+          <w:rFonts w:ascii="Consolas" w:cs="Consolas" w:eastAsia="Consolas" w:hAnsi="Consolas"/>
+          <w:sz w:val="18"/>
+          <w:szCs w:val="18"/>
+        </w:rPr>
+        <w:t xml:space="preserve"> </w:t>
+      </w:r>
+    </w:p>
+    <w:p>
+      <w:pPr>
+        <w:shd w:fill="F2F2F2" w:color="auto" w:val="clear"/>
+        <w:spacing w:after="0" w:before="0" w:line="240"/>
+        <w:ind w:left="360"/>
+      </w:pPr>
+      <w:r>
+        <w:rPr>
+          <w:rFonts w:ascii="Consolas" w:cs="Consolas" w:eastAsia="Consolas" w:hAnsi="Consolas"/>
+          <w:sz w:val="18"/>
+          <w:szCs w:val="18"/>
+        </w:rPr>
+        <w:t xml:space="preserve">AlumnoDuplicadoException::AlumnoDuplicadoException(const std::string&amp; codigo)</w:t>
+      </w:r>
+    </w:p>
+    <w:p>
+      <w:pPr>
+        <w:shd w:fill="F2F2F2" w:color="auto" w:val="clear"/>
+        <w:spacing w:after="240" w:before="0" w:line="240"/>
+        <w:ind w:left="360"/>
+      </w:pPr>
+      <w:r>
+        <w:rPr>
+          <w:rFonts w:ascii="Consolas" w:cs="Consolas" w:eastAsia="Consolas" w:hAnsi="Consolas"/>
+          <w:sz w:val="18"/>
+          <w:szCs w:val="18"/>
+        </w:rPr>
+        <w:t xml:space="preserve">    : RegistroException("Ya existe un alumno con el código " + codigo) {}</w:t>
+      </w:r>
+    </w:p>
+    <w:p>
+      <w:pPr>
+        <w:spacing w:line="480"/>
+        <w:ind w:firstLine="720"/>
+      </w:pPr>
+      <w:r>
+        <w:rPr>
+          <w:rFonts w:ascii="Times New Roman" w:cs="Times New Roman" w:eastAsia="Times New Roman" w:hAnsi="Times New Roman"/>
+        </w:rPr>
+        <w:t xml:space="preserve">Los errores de conversión de la biblioteca estándar, std::invalid_argument y std::out_of_range, se capturan en el módulo de entrada y se relanzan como EntradaInvalidaException, con un mensaje que indica el campo y el motivo:</w:t>
+      </w:r>
+    </w:p>
+    <w:p>
+      <w:pPr>
+        <w:shd w:fill="F2F2F2" w:color="auto" w:val="clear"/>
+        <w:spacing w:after="0" w:before="120" w:line="240"/>
+        <w:ind w:left="360"/>
+      </w:pPr>
+      <w:r>
+        <w:rPr>
+          <w:rFonts w:ascii="Consolas" w:cs="Consolas" w:eastAsia="Consolas" w:hAnsi="Consolas"/>
+          <w:sz w:val="18"/>
+          <w:szCs w:val="18"/>
+        </w:rPr>
+        <w:t xml:space="preserve">int convertirEntero(const std::string&amp; texto, const std::string&amp; campo, int min, int max) {</w:t>
+      </w:r>
+    </w:p>
+    <w:p>
+      <w:pPr>
+        <w:shd w:fill="F2F2F2" w:color="auto" w:val="clear"/>
+        <w:spacing w:after="0" w:before="0" w:line="240"/>
+        <w:ind w:left="360"/>
+      </w:pPr>
+      <w:r>
+        <w:rPr>
+          <w:rFonts w:ascii="Consolas" w:cs="Consolas" w:eastAsia="Consolas" w:hAnsi="Consolas"/>
+          <w:sz w:val="18"/>
+          <w:szCs w:val="18"/>
+        </w:rPr>
+        <w:t xml:space="preserve">    int valor = 0;</w:t>
+      </w:r>
+    </w:p>
+    <w:p>
+      <w:pPr>
+        <w:shd w:fill="F2F2F2" w:color="auto" w:val="clear"/>
+        <w:spacing w:after="0" w:before="0" w:line="240"/>
+        <w:ind w:left="360"/>
+      </w:pPr>
+      <w:r>
+        <w:rPr>
+          <w:rFonts w:ascii="Consolas" w:cs="Consolas" w:eastAsia="Consolas" w:hAnsi="Consolas"/>
+          <w:sz w:val="18"/>
+          <w:szCs w:val="18"/>
+        </w:rPr>
+        <w:t xml:space="preserve">    std::size_t pos = 0;</w:t>
+      </w:r>
+    </w:p>
+    <w:p>
+      <w:pPr>
+        <w:shd w:fill="F2F2F2" w:color="auto" w:val="clear"/>
+        <w:spacing w:after="0" w:before="0" w:line="240"/>
+        <w:ind w:left="360"/>
+      </w:pPr>
+      <w:r>
+        <w:rPr>
+          <w:rFonts w:ascii="Consolas" w:cs="Consolas" w:eastAsia="Consolas" w:hAnsi="Consolas"/>
+          <w:sz w:val="18"/>
+          <w:szCs w:val="18"/>
+        </w:rPr>
+        <w:t xml:space="preserve">    try {</w:t>
+      </w:r>
+    </w:p>
+    <w:p>
+      <w:pPr>
+        <w:shd w:fill="F2F2F2" w:color="auto" w:val="clear"/>
+        <w:spacing w:after="0" w:before="0" w:line="240"/>
+        <w:ind w:left="360"/>
+      </w:pPr>
+      <w:r>
+        <w:rPr>
+          <w:rFonts w:ascii="Consolas" w:cs="Consolas" w:eastAsia="Consolas" w:hAnsi="Consolas"/>
+          <w:sz w:val="18"/>
+          <w:szCs w:val="18"/>
+        </w:rPr>
+        <w:t xml:space="preserve">        valor = std::stoi(texto, &amp;pos);</w:t>
+      </w:r>
+    </w:p>
+    <w:p>
+      <w:pPr>
+        <w:shd w:fill="F2F2F2" w:color="auto" w:val="clear"/>
+        <w:spacing w:after="0" w:before="0" w:line="240"/>
+        <w:ind w:left="360"/>
+      </w:pPr>
+      <w:r>
+        <w:rPr>
+          <w:rFonts w:ascii="Consolas" w:cs="Consolas" w:eastAsia="Consolas" w:hAnsi="Consolas"/>
+          <w:sz w:val="18"/>
+          <w:szCs w:val="18"/>
+        </w:rPr>
+        <w:t xml:space="preserve">    } catch (const std::invalid_argument&amp;) {</w:t>
+      </w:r>
+    </w:p>
+    <w:p>
+      <w:pPr>
+        <w:shd w:fill="F2F2F2" w:color="auto" w:val="clear"/>
+        <w:spacing w:after="0" w:before="0" w:line="240"/>
+        <w:ind w:left="360"/>
+      </w:pPr>
+      <w:r>
+        <w:rPr>
+          <w:rFonts w:ascii="Consolas" w:cs="Consolas" w:eastAsia="Consolas" w:hAnsi="Consolas"/>
+          <w:sz w:val="18"/>
+          <w:szCs w:val="18"/>
+        </w:rPr>
+        <w:t xml:space="preserve">        throw EntradaInvalidaException(campo, "debe ser un número entero");</w:t>
+      </w:r>
+    </w:p>
+    <w:p>
+      <w:pPr>
+        <w:shd w:fill="F2F2F2" w:color="auto" w:val="clear"/>
+        <w:spacing w:after="0" w:before="0" w:line="240"/>
+        <w:ind w:left="360"/>
+      </w:pPr>
+      <w:r>
+        <w:rPr>
+          <w:rFonts w:ascii="Consolas" w:cs="Consolas" w:eastAsia="Consolas" w:hAnsi="Consolas"/>
+          <w:sz w:val="18"/>
+          <w:szCs w:val="18"/>
+        </w:rPr>
+        <w:t xml:space="preserve">    } catch (const std::out_of_range&amp;) {</w:t>
+      </w:r>
+    </w:p>
+    <w:p>
+      <w:pPr>
+        <w:shd w:fill="F2F2F2" w:color="auto" w:val="clear"/>
+        <w:spacing w:after="0" w:before="0" w:line="240"/>
+        <w:ind w:left="360"/>
+      </w:pPr>
+      <w:r>
+        <w:rPr>
+          <w:rFonts w:ascii="Consolas" w:cs="Consolas" w:eastAsia="Consolas" w:hAnsi="Consolas"/>
+          <w:sz w:val="18"/>
+          <w:szCs w:val="18"/>
+        </w:rPr>
+        <w:t xml:space="preserve">        throw EntradaInvalidaException(campo, "el número es demasiado grande");</w:t>
+      </w:r>
+    </w:p>
+    <w:p>
+      <w:pPr>
+        <w:shd w:fill="F2F2F2" w:color="auto" w:val="clear"/>
+        <w:spacing w:after="0" w:before="0" w:line="240"/>
+        <w:ind w:left="360"/>
+      </w:pPr>
+      <w:r>
+        <w:rPr>
+          <w:rFonts w:ascii="Consolas" w:cs="Consolas" w:eastAsia="Consolas" w:hAnsi="Consolas"/>
+          <w:sz w:val="18"/>
+          <w:szCs w:val="18"/>
+        </w:rPr>
+        <w:t xml:space="preserve">    }</w:t>
+      </w:r>
+    </w:p>
+    <w:p>
+      <w:pPr>
+        <w:shd w:fill="F2F2F2" w:color="auto" w:val="clear"/>
+        <w:spacing w:after="0" w:before="0" w:line="240"/>
+        <w:ind w:left="360"/>
+      </w:pPr>
+      <w:r>
+        <w:rPr>
+          <w:rFonts w:ascii="Consolas" w:cs="Consolas" w:eastAsia="Consolas" w:hAnsi="Consolas"/>
+          <w:sz w:val="18"/>
+          <w:szCs w:val="18"/>
+        </w:rPr>
+        <w:t xml:space="preserve">    if (pos != texto.size()) {</w:t>
+      </w:r>
+    </w:p>
+    <w:p>
+      <w:pPr>
+        <w:shd w:fill="F2F2F2" w:color="auto" w:val="clear"/>
+        <w:spacing w:after="0" w:before="0" w:line="240"/>
+        <w:ind w:left="360"/>
+      </w:pPr>
+      <w:r>
+        <w:rPr>
+          <w:rFonts w:ascii="Consolas" w:cs="Consolas" w:eastAsia="Consolas" w:hAnsi="Consolas"/>
+          <w:sz w:val="18"/>
+          <w:szCs w:val="18"/>
+        </w:rPr>
+        <w:t xml:space="preserve">        throw EntradaInvalidaException(campo, "debe ser un número entero");</w:t>
+      </w:r>
+    </w:p>
+    <w:p>
+      <w:pPr>
+        <w:shd w:fill="F2F2F2" w:color="auto" w:val="clear"/>
+        <w:spacing w:after="0" w:before="0" w:line="240"/>
+        <w:ind w:left="360"/>
+      </w:pPr>
+      <w:r>
+        <w:rPr>
+          <w:rFonts w:ascii="Consolas" w:cs="Consolas" w:eastAsia="Consolas" w:hAnsi="Consolas"/>
+          <w:sz w:val="18"/>
+          <w:szCs w:val="18"/>
+        </w:rPr>
+        <w:t xml:space="preserve">    }</w:t>
+      </w:r>
+    </w:p>
+    <w:p>
+      <w:pPr>
+        <w:shd w:fill="F2F2F2" w:color="auto" w:val="clear"/>
+        <w:spacing w:after="0" w:before="0" w:line="240"/>
+        <w:ind w:left="360"/>
+      </w:pPr>
+      <w:r>
+        <w:rPr>
+          <w:rFonts w:ascii="Consolas" w:cs="Consolas" w:eastAsia="Consolas" w:hAnsi="Consolas"/>
+          <w:sz w:val="18"/>
+          <w:szCs w:val="18"/>
+        </w:rPr>
+        <w:t xml:space="preserve">    if (valor &lt; min || valor &gt; max) {</w:t>
+      </w:r>
+    </w:p>
+    <w:p>
+      <w:pPr>
+        <w:shd w:fill="F2F2F2" w:color="auto" w:val="clear"/>
+        <w:spacing w:after="0" w:before="0" w:line="240"/>
+        <w:ind w:left="360"/>
+      </w:pPr>
+      <w:r>
+        <w:rPr>
+          <w:rFonts w:ascii="Consolas" w:cs="Consolas" w:eastAsia="Consolas" w:hAnsi="Consolas"/>
+          <w:sz w:val="18"/>
+          <w:szCs w:val="18"/>
+        </w:rPr>
+        <w:t xml:space="preserve">        throw EntradaInvalidaException(campo, "debe estar entre " + std::to_string(min) + " y " + std::to_string(max));</w:t>
+      </w:r>
+    </w:p>
+    <w:p>
+      <w:pPr>
+        <w:shd w:fill="F2F2F2" w:color="auto" w:val="clear"/>
+        <w:spacing w:after="0" w:before="0" w:line="240"/>
+        <w:ind w:left="360"/>
+      </w:pPr>
+      <w:r>
+        <w:rPr>
+          <w:rFonts w:ascii="Consolas" w:cs="Consolas" w:eastAsia="Consolas" w:hAnsi="Consolas"/>
+          <w:sz w:val="18"/>
+          <w:szCs w:val="18"/>
+        </w:rPr>
+        <w:t xml:space="preserve">    }</w:t>
+      </w:r>
+    </w:p>
+    <w:p>
+      <w:pPr>
+        <w:shd w:fill="F2F2F2" w:color="auto" w:val="clear"/>
+        <w:spacing w:after="0" w:before="0" w:line="240"/>
+        <w:ind w:left="360"/>
+      </w:pPr>
+      <w:r>
+        <w:rPr>
+          <w:rFonts w:ascii="Consolas" w:cs="Consolas" w:eastAsia="Consolas" w:hAnsi="Consolas"/>
+          <w:sz w:val="18"/>
+          <w:szCs w:val="18"/>
+        </w:rPr>
+        <w:t xml:space="preserve">    return valor;</w:t>
+      </w:r>
+    </w:p>
+    <w:p>
+      <w:pPr>
+        <w:shd w:fill="F2F2F2" w:color="auto" w:val="clear"/>
+        <w:spacing w:after="240" w:before="0" w:line="240"/>
+        <w:ind w:left="360"/>
+      </w:pPr>
+      <w:r>
+        <w:rPr>
+          <w:rFonts w:ascii="Consolas" w:cs="Consolas" w:eastAsia="Consolas" w:hAnsi="Consolas"/>
+          <w:sz w:val="18"/>
+          <w:szCs w:val="18"/>
+        </w:rPr>
+        <w:t xml:space="preserve">}</w:t>
+      </w:r>
+    </w:p>
+    <w:p>
+      <w:pPr>
+        <w:spacing w:line="480"/>
+        <w:ind w:firstLine="720"/>
+      </w:pPr>
+      <w:r>
+        <w:rPr>
+          <w:rFonts w:ascii="Times New Roman" w:cs="Times New Roman" w:eastAsia="Times New Roman" w:hAnsi="Times New Roman"/>
+        </w:rPr>
+        <w:t xml:space="preserve">Al cargar el archivo, si no se puede abrir se lanza ArchivoNoEncontradoException; si una línea no tiene cuatro campos o sus datos no son válidos, la EntradaInvalidaException de la validación se transforma en ArchivoCorruptoException con el número de línea:</w:t>
+      </w:r>
+    </w:p>
+    <w:p>
+      <w:pPr>
+        <w:shd w:fill="F2F2F2" w:color="auto" w:val="clear"/>
+        <w:spacing w:after="0" w:before="120" w:line="240"/>
+        <w:ind w:left="360"/>
+      </w:pPr>
+      <w:r>
+        <w:rPr>
+          <w:rFonts w:ascii="Consolas" w:cs="Consolas" w:eastAsia="Consolas" w:hAnsi="Consolas"/>
+          <w:sz w:val="18"/>
+          <w:szCs w:val="18"/>
+        </w:rPr>
+        <w:t xml:space="preserve">std::vector&lt;Alumno&gt; cargarAlumnos(const std::string&amp; ruta) {</w:t>
+      </w:r>
+    </w:p>
+    <w:p>
+      <w:pPr>
+        <w:shd w:fill="F2F2F2" w:color="auto" w:val="clear"/>
+        <w:spacing w:after="0" w:before="0" w:line="240"/>
+        <w:ind w:left="360"/>
+      </w:pPr>
+      <w:r>
+        <w:rPr>
+          <w:rFonts w:ascii="Consolas" w:cs="Consolas" w:eastAsia="Consolas" w:hAnsi="Consolas"/>
+          <w:sz w:val="18"/>
+          <w:szCs w:val="18"/>
+        </w:rPr>
+        <w:t xml:space="preserve">    std::ifstream archivo(ruta);</w:t>
+      </w:r>
+    </w:p>
+    <w:p>
+      <w:pPr>
+        <w:shd w:fill="F2F2F2" w:color="auto" w:val="clear"/>
+        <w:spacing w:after="0" w:before="0" w:line="240"/>
+        <w:ind w:left="360"/>
+      </w:pPr>
+      <w:r>
+        <w:rPr>
+          <w:rFonts w:ascii="Consolas" w:cs="Consolas" w:eastAsia="Consolas" w:hAnsi="Consolas"/>
+          <w:sz w:val="18"/>
+          <w:szCs w:val="18"/>
+        </w:rPr>
+        <w:t xml:space="preserve">    if (!archivo) {</w:t>
+      </w:r>
+    </w:p>
+    <w:p>
+      <w:pPr>
+        <w:shd w:fill="F2F2F2" w:color="auto" w:val="clear"/>
+        <w:spacing w:after="0" w:before="0" w:line="240"/>
+        <w:ind w:left="360"/>
+      </w:pPr>
+      <w:r>
+        <w:rPr>
+          <w:rFonts w:ascii="Consolas" w:cs="Consolas" w:eastAsia="Consolas" w:hAnsi="Consolas"/>
+          <w:sz w:val="18"/>
+          <w:szCs w:val="18"/>
+        </w:rPr>
+        <w:t xml:space="preserve">        throw ArchivoNoEncontradoException(ruta);</w:t>
+      </w:r>
+    </w:p>
+    <w:p>
+      <w:pPr>
+        <w:shd w:fill="F2F2F2" w:color="auto" w:val="clear"/>
+        <w:spacing w:after="0" w:before="0" w:line="240"/>
+        <w:ind w:left="360"/>
+      </w:pPr>
+      <w:r>
+        <w:rPr>
+          <w:rFonts w:ascii="Consolas" w:cs="Consolas" w:eastAsia="Consolas" w:hAnsi="Consolas"/>
+          <w:sz w:val="18"/>
+          <w:szCs w:val="18"/>
+        </w:rPr>
+        <w:t xml:space="preserve">    }</w:t>
+      </w:r>
+    </w:p>
+    <w:p>
+      <w:pPr>
+        <w:shd w:fill="F2F2F2" w:color="auto" w:val="clear"/>
+        <w:spacing w:after="0" w:before="0" w:line="240"/>
+        <w:ind w:left="360"/>
+      </w:pPr>
+      <w:r>
+        <w:rPr>
+          <w:rFonts w:ascii="Consolas" w:cs="Consolas" w:eastAsia="Consolas" w:hAnsi="Consolas"/>
+          <w:sz w:val="18"/>
+          <w:szCs w:val="18"/>
+        </w:rPr>
+        <w:t xml:space="preserve">    std::vector&lt;Alumno&gt; alumnos;</w:t>
+      </w:r>
+    </w:p>
+    <w:p>
+      <w:pPr>
+        <w:shd w:fill="F2F2F2" w:color="auto" w:val="clear"/>
+        <w:spacing w:after="0" w:before="0" w:line="240"/>
+        <w:ind w:left="360"/>
+      </w:pPr>
+      <w:r>
+        <w:rPr>
+          <w:rFonts w:ascii="Consolas" w:cs="Consolas" w:eastAsia="Consolas" w:hAnsi="Consolas"/>
+          <w:sz w:val="18"/>
+          <w:szCs w:val="18"/>
+        </w:rPr>
+        <w:t xml:space="preserve">    std::string linea;</w:t>
+      </w:r>
+    </w:p>
+    <w:p>
+      <w:pPr>
+        <w:shd w:fill="F2F2F2" w:color="auto" w:val="clear"/>
+        <w:spacing w:after="0" w:before="0" w:line="240"/>
+        <w:ind w:left="360"/>
+      </w:pPr>
+      <w:r>
+        <w:rPr>
+          <w:rFonts w:ascii="Consolas" w:cs="Consolas" w:eastAsia="Consolas" w:hAnsi="Consolas"/>
+          <w:sz w:val="18"/>
+          <w:szCs w:val="18"/>
+        </w:rPr>
+        <w:t xml:space="preserve">    int numero = 0;</w:t>
+      </w:r>
+    </w:p>
+    <w:p>
+      <w:pPr>
+        <w:shd w:fill="F2F2F2" w:color="auto" w:val="clear"/>
+        <w:spacing w:after="0" w:before="0" w:line="240"/>
+        <w:ind w:left="360"/>
+      </w:pPr>
+      <w:r>
+        <w:rPr>
+          <w:rFonts w:ascii="Consolas" w:cs="Consolas" w:eastAsia="Consolas" w:hAnsi="Consolas"/>
+          <w:sz w:val="18"/>
+          <w:szCs w:val="18"/>
+        </w:rPr>
+        <w:t xml:space="preserve">    while (std::getline(archivo, linea)) {</w:t>
+      </w:r>
+    </w:p>
+    <w:p>
+      <w:pPr>
+        <w:shd w:fill="F2F2F2" w:color="auto" w:val="clear"/>
+        <w:spacing w:after="0" w:before="0" w:line="240"/>
+        <w:ind w:left="360"/>
+      </w:pPr>
+      <w:r>
+        <w:rPr>
+          <w:rFonts w:ascii="Consolas" w:cs="Consolas" w:eastAsia="Consolas" w:hAnsi="Consolas"/>
+          <w:sz w:val="18"/>
+          <w:szCs w:val="18"/>
+        </w:rPr>
+        <w:t xml:space="preserve">        ++numero;</w:t>
+      </w:r>
+    </w:p>
+    <w:p>
+      <w:pPr>
+        <w:shd w:fill="F2F2F2" w:color="auto" w:val="clear"/>
+        <w:spacing w:after="0" w:before="0" w:line="240"/>
+        <w:ind w:left="360"/>
+      </w:pPr>
+      <w:r>
+        <w:rPr>
+          <w:rFonts w:ascii="Consolas" w:cs="Consolas" w:eastAsia="Consolas" w:hAnsi="Consolas"/>
+          <w:sz w:val="18"/>
+          <w:szCs w:val="18"/>
+        </w:rPr>
+        <w:t xml:space="preserve">        if (linea.empty() || linea[0] == '#') {</w:t>
+      </w:r>
+    </w:p>
+    <w:p>
+      <w:pPr>
+        <w:shd w:fill="F2F2F2" w:color="auto" w:val="clear"/>
+        <w:spacing w:after="0" w:before="0" w:line="240"/>
+        <w:ind w:left="360"/>
+      </w:pPr>
+      <w:r>
+        <w:rPr>
+          <w:rFonts w:ascii="Consolas" w:cs="Consolas" w:eastAsia="Consolas" w:hAnsi="Consolas"/>
+          <w:sz w:val="18"/>
+          <w:szCs w:val="18"/>
+        </w:rPr>
+        <w:t xml:space="preserve">            continue;</w:t>
+      </w:r>
+    </w:p>
+    <w:p>
+      <w:pPr>
+        <w:shd w:fill="F2F2F2" w:color="auto" w:val="clear"/>
+        <w:spacing w:after="0" w:before="0" w:line="240"/>
+        <w:ind w:left="360"/>
+      </w:pPr>
+      <w:r>
+        <w:rPr>
+          <w:rFonts w:ascii="Consolas" w:cs="Consolas" w:eastAsia="Consolas" w:hAnsi="Consolas"/>
+          <w:sz w:val="18"/>
+          <w:szCs w:val="18"/>
+        </w:rPr>
+        <w:t xml:space="preserve">        }</w:t>
+      </w:r>
+    </w:p>
+    <w:p>
+      <w:pPr>
+        <w:shd w:fill="F2F2F2" w:color="auto" w:val="clear"/>
+        <w:spacing w:after="0" w:before="0" w:line="240"/>
+        <w:ind w:left="360"/>
+      </w:pPr>
+      <w:r>
+        <w:rPr>
+          <w:rFonts w:ascii="Consolas" w:cs="Consolas" w:eastAsia="Consolas" w:hAnsi="Consolas"/>
+          <w:sz w:val="18"/>
+          <w:szCs w:val="18"/>
+        </w:rPr>
+        <w:t xml:space="preserve">        std::vector&lt;std::string&gt; campos;</w:t>
+      </w:r>
+    </w:p>
+    <w:p>
+      <w:pPr>
+        <w:shd w:fill="F2F2F2" w:color="auto" w:val="clear"/>
+        <w:spacing w:after="0" w:before="0" w:line="240"/>
+        <w:ind w:left="360"/>
+      </w:pPr>
+      <w:r>
+        <w:rPr>
+          <w:rFonts w:ascii="Consolas" w:cs="Consolas" w:eastAsia="Consolas" w:hAnsi="Consolas"/>
+          <w:sz w:val="18"/>
+          <w:szCs w:val="18"/>
+        </w:rPr>
+        <w:t xml:space="preserve">        std::stringstream partes(linea);</w:t>
+      </w:r>
+    </w:p>
+    <w:p>
+      <w:pPr>
+        <w:shd w:fill="F2F2F2" w:color="auto" w:val="clear"/>
+        <w:spacing w:after="0" w:before="0" w:line="240"/>
+        <w:ind w:left="360"/>
+      </w:pPr>
+      <w:r>
+        <w:rPr>
+          <w:rFonts w:ascii="Consolas" w:cs="Consolas" w:eastAsia="Consolas" w:hAnsi="Consolas"/>
+          <w:sz w:val="18"/>
+          <w:szCs w:val="18"/>
+        </w:rPr>
+        <w:t xml:space="preserve">        std::string campo;</w:t>
+      </w:r>
+    </w:p>
+    <w:p>
+      <w:pPr>
+        <w:shd w:fill="F2F2F2" w:color="auto" w:val="clear"/>
+        <w:spacing w:after="0" w:before="0" w:line="240"/>
+        <w:ind w:left="360"/>
+      </w:pPr>
+      <w:r>
+        <w:rPr>
+          <w:rFonts w:ascii="Consolas" w:cs="Consolas" w:eastAsia="Consolas" w:hAnsi="Consolas"/>
+          <w:sz w:val="18"/>
+          <w:szCs w:val="18"/>
+        </w:rPr>
+        <w:t xml:space="preserve">        while (std::getline(partes, campo, ';')) {</w:t>
+      </w:r>
+    </w:p>
+    <w:p>
+      <w:pPr>
+        <w:shd w:fill="F2F2F2" w:color="auto" w:val="clear"/>
+        <w:spacing w:after="0" w:before="0" w:line="240"/>
+        <w:ind w:left="360"/>
+      </w:pPr>
+      <w:r>
+        <w:rPr>
+          <w:rFonts w:ascii="Consolas" w:cs="Consolas" w:eastAsia="Consolas" w:hAnsi="Consolas"/>
+          <w:sz w:val="18"/>
+          <w:szCs w:val="18"/>
+        </w:rPr>
+        <w:t xml:space="preserve">            campos.push_back(campo);</w:t>
+      </w:r>
+    </w:p>
+    <w:p>
+      <w:pPr>
+        <w:shd w:fill="F2F2F2" w:color="auto" w:val="clear"/>
+        <w:spacing w:after="0" w:before="0" w:line="240"/>
+        <w:ind w:left="360"/>
+      </w:pPr>
+      <w:r>
+        <w:rPr>
+          <w:rFonts w:ascii="Consolas" w:cs="Consolas" w:eastAsia="Consolas" w:hAnsi="Consolas"/>
+          <w:sz w:val="18"/>
+          <w:szCs w:val="18"/>
+        </w:rPr>
+        <w:t xml:space="preserve">        }</w:t>
+      </w:r>
+    </w:p>
+    <w:p>
+      <w:pPr>
+        <w:shd w:fill="F2F2F2" w:color="auto" w:val="clear"/>
+        <w:spacing w:after="0" w:before="0" w:line="240"/>
+        <w:ind w:left="360"/>
+      </w:pPr>
+      <w:r>
+        <w:rPr>
+          <w:rFonts w:ascii="Consolas" w:cs="Consolas" w:eastAsia="Consolas" w:hAnsi="Consolas"/>
+          <w:sz w:val="18"/>
+          <w:szCs w:val="18"/>
+        </w:rPr>
+        <w:t xml:space="preserve">        if (campos.size() != 4) {</w:t>
+      </w:r>
+    </w:p>
+    <w:p>
+      <w:pPr>
+        <w:shd w:fill="F2F2F2" w:color="auto" w:val="clear"/>
+        <w:spacing w:after="0" w:before="0" w:line="240"/>
+        <w:ind w:left="360"/>
+      </w:pPr>
+      <w:r>
+        <w:rPr>
+          <w:rFonts w:ascii="Consolas" w:cs="Consolas" w:eastAsia="Consolas" w:hAnsi="Consolas"/>
+          <w:sz w:val="18"/>
+          <w:szCs w:val="18"/>
+        </w:rPr>
+        <w:t xml:space="preserve">            throw ArchivoCorruptoException(ruta, numero, "se esperaban 4 campos");</w:t>
+      </w:r>
+    </w:p>
+    <w:p>
+      <w:pPr>
+        <w:shd w:fill="F2F2F2" w:color="auto" w:val="clear"/>
+        <w:spacing w:after="0" w:before="0" w:line="240"/>
+        <w:ind w:left="360"/>
+      </w:pPr>
+      <w:r>
+        <w:rPr>
+          <w:rFonts w:ascii="Consolas" w:cs="Consolas" w:eastAsia="Consolas" w:hAnsi="Consolas"/>
+          <w:sz w:val="18"/>
+          <w:szCs w:val="18"/>
+        </w:rPr>
+        <w:t xml:space="preserve">        }</w:t>
+      </w:r>
+    </w:p>
+    <w:p>
+      <w:pPr>
+        <w:shd w:fill="F2F2F2" w:color="auto" w:val="clear"/>
+        <w:spacing w:after="0" w:before="0" w:line="240"/>
+        <w:ind w:left="360"/>
+      </w:pPr>
+      <w:r>
+        <w:rPr>
+          <w:rFonts w:ascii="Consolas" w:cs="Consolas" w:eastAsia="Consolas" w:hAnsi="Consolas"/>
+          <w:sz w:val="18"/>
+          <w:szCs w:val="18"/>
+        </w:rPr>
+        <w:t xml:space="preserve">        try {</w:t>
+      </w:r>
+    </w:p>
+    <w:p>
+      <w:pPr>
+        <w:shd w:fill="F2F2F2" w:color="auto" w:val="clear"/>
+        <w:spacing w:after="0" w:before="0" w:line="240"/>
+        <w:ind w:left="360"/>
+      </w:pPr>
+      <w:r>
+        <w:rPr>
+          <w:rFonts w:ascii="Consolas" w:cs="Consolas" w:eastAsia="Consolas" w:hAnsi="Consolas"/>
+          <w:sz w:val="18"/>
+          <w:szCs w:val="18"/>
+        </w:rPr>
+        <w:t xml:space="preserve">            Alumno alumno;</w:t>
+      </w:r>
+    </w:p>
+    <w:p>
+      <w:pPr>
+        <w:shd w:fill="F2F2F2" w:color="auto" w:val="clear"/>
+        <w:spacing w:after="0" w:before="0" w:line="240"/>
+        <w:ind w:left="360"/>
+      </w:pPr>
+      <w:r>
+        <w:rPr>
+          <w:rFonts w:ascii="Consolas" w:cs="Consolas" w:eastAsia="Consolas" w:hAnsi="Consolas"/>
+          <w:sz w:val="18"/>
+          <w:szCs w:val="18"/>
+        </w:rPr>
+        <w:t xml:space="preserve">            alumno.codigo = validarCodigo(campos[0]);</w:t>
+      </w:r>
+    </w:p>
+    <w:p>
+      <w:pPr>
+        <w:shd w:fill="F2F2F2" w:color="auto" w:val="clear"/>
+        <w:spacing w:after="0" w:before="0" w:line="240"/>
+        <w:ind w:left="360"/>
+      </w:pPr>
+      <w:r>
+        <w:rPr>
+          <w:rFonts w:ascii="Consolas" w:cs="Consolas" w:eastAsia="Consolas" w:hAnsi="Consolas"/>
+          <w:sz w:val="18"/>
+          <w:szCs w:val="18"/>
+        </w:rPr>
+        <w:t xml:space="preserve">            alumno.nombre = validarNombre(campos[1]);</w:t>
+      </w:r>
+    </w:p>
+    <w:p>
+      <w:pPr>
+        <w:shd w:fill="F2F2F2" w:color="auto" w:val="clear"/>
+        <w:spacing w:after="0" w:before="0" w:line="240"/>
+        <w:ind w:left="360"/>
+      </w:pPr>
+      <w:r>
+        <w:rPr>
+          <w:rFonts w:ascii="Consolas" w:cs="Consolas" w:eastAsia="Consolas" w:hAnsi="Consolas"/>
+          <w:sz w:val="18"/>
+          <w:szCs w:val="18"/>
+        </w:rPr>
+        <w:t xml:space="preserve">            alumno.edad = convertirEntero(campos[2], "edad", 15, 99);</w:t>
+      </w:r>
+    </w:p>
+    <w:p>
+      <w:pPr>
+        <w:shd w:fill="F2F2F2" w:color="auto" w:val="clear"/>
+        <w:spacing w:after="0" w:before="0" w:line="240"/>
+        <w:ind w:left="360"/>
+      </w:pPr>
+      <w:r>
+        <w:rPr>
+          <w:rFonts w:ascii="Consolas" w:cs="Consolas" w:eastAsia="Consolas" w:hAnsi="Consolas"/>
+          <w:sz w:val="18"/>
+          <w:szCs w:val="18"/>
+        </w:rPr>
+        <w:t xml:space="preserve">            alumno.nota = convertirNota(campos[3]);</w:t>
+      </w:r>
+    </w:p>
+    <w:p>
+      <w:pPr>
+        <w:shd w:fill="F2F2F2" w:color="auto" w:val="clear"/>
+        <w:spacing w:after="0" w:before="0" w:line="240"/>
+        <w:ind w:left="360"/>
+      </w:pPr>
+      <w:r>
+        <w:rPr>
+          <w:rFonts w:ascii="Consolas" w:cs="Consolas" w:eastAsia="Consolas" w:hAnsi="Consolas"/>
+          <w:sz w:val="18"/>
+          <w:szCs w:val="18"/>
+        </w:rPr>
+        <w:t xml:space="preserve">            alumnos.push_back(alumno);</w:t>
+      </w:r>
+    </w:p>
+    <w:p>
+      <w:pPr>
+        <w:shd w:fill="F2F2F2" w:color="auto" w:val="clear"/>
+        <w:spacing w:after="0" w:before="0" w:line="240"/>
+        <w:ind w:left="360"/>
+      </w:pPr>
+      <w:r>
+        <w:rPr>
+          <w:rFonts w:ascii="Consolas" w:cs="Consolas" w:eastAsia="Consolas" w:hAnsi="Consolas"/>
+          <w:sz w:val="18"/>
+          <w:szCs w:val="18"/>
+        </w:rPr>
+        <w:t xml:space="preserve">        } catch (const EntradaInvalidaException&amp; e) {</w:t>
+      </w:r>
+    </w:p>
+    <w:p>
+      <w:pPr>
+        <w:shd w:fill="F2F2F2" w:color="auto" w:val="clear"/>
+        <w:spacing w:after="0" w:before="0" w:line="240"/>
+        <w:ind w:left="360"/>
+      </w:pPr>
+      <w:r>
+        <w:rPr>
+          <w:rFonts w:ascii="Consolas" w:cs="Consolas" w:eastAsia="Consolas" w:hAnsi="Consolas"/>
+          <w:sz w:val="18"/>
+          <w:szCs w:val="18"/>
+        </w:rPr>
+        <w:t xml:space="preserve">            throw ArchivoCorruptoException(ruta, numero, e.what());</w:t>
+      </w:r>
+    </w:p>
+    <w:p>
+      <w:pPr>
+        <w:shd w:fill="F2F2F2" w:color="auto" w:val="clear"/>
+        <w:spacing w:after="0" w:before="0" w:line="240"/>
+        <w:ind w:left="360"/>
+      </w:pPr>
+      <w:r>
+        <w:rPr>
+          <w:rFonts w:ascii="Consolas" w:cs="Consolas" w:eastAsia="Consolas" w:hAnsi="Consolas"/>
+          <w:sz w:val="18"/>
+          <w:szCs w:val="18"/>
+        </w:rPr>
+        <w:t xml:space="preserve">        }</w:t>
+      </w:r>
+    </w:p>
+    <w:p>
+      <w:pPr>
+        <w:shd w:fill="F2F2F2" w:color="auto" w:val="clear"/>
+        <w:spacing w:after="0" w:before="0" w:line="240"/>
+        <w:ind w:left="360"/>
+      </w:pPr>
+      <w:r>
+        <w:rPr>
+          <w:rFonts w:ascii="Consolas" w:cs="Consolas" w:eastAsia="Consolas" w:hAnsi="Consolas"/>
+          <w:sz w:val="18"/>
+          <w:szCs w:val="18"/>
+        </w:rPr>
+        <w:t xml:space="preserve">    }</w:t>
+      </w:r>
+    </w:p>
+    <w:p>
+      <w:pPr>
+        <w:shd w:fill="F2F2F2" w:color="auto" w:val="clear"/>
+        <w:spacing w:after="0" w:before="0" w:line="240"/>
+        <w:ind w:left="360"/>
+      </w:pPr>
+      <w:r>
+        <w:rPr>
+          <w:rFonts w:ascii="Consolas" w:cs="Consolas" w:eastAsia="Consolas" w:hAnsi="Consolas"/>
+          <w:sz w:val="18"/>
+          <w:szCs w:val="18"/>
+        </w:rPr>
+        <w:t xml:space="preserve">    return alumnos;</w:t>
       </w:r>
     </w:p>
     <w:p>
@@ -5882,7 +7851,7 @@
           <w:b/>
           <w:bCs/>
         </w:rPr>
-        <w:t xml:space="preserve">Figura 3</w:t>
+        <w:t xml:space="preserve">Figura 4</w:t>
       </w:r>
     </w:p>
     <w:p>
@@ -5900,21 +7869,48 @@
     </w:p>
     <w:p>
       <w:pPr>
-        <w:pBdr>
-          <w:top w:val="dashed" w:color="999999" w:sz="6" w:space="8"/>
-          <w:left w:val="dashed" w:color="999999" w:sz="6" w:space="8"/>
-          <w:bottom w:val="dashed" w:color="999999" w:sz="6" w:space="8"/>
-          <w:right w:val="dashed" w:color="999999" w:sz="6" w:space="8"/>
-        </w:pBdr>
         <w:spacing w:after="120" w:before="120"/>
         <w:jc w:val="center"/>
       </w:pPr>
       <w:r>
-        <w:rPr>
-          <w:rFonts w:ascii="Times New Roman" w:cs="Times New Roman" w:eastAsia="Times New Roman" w:hAnsi="Times New Roman"/>
-          <w:highlight w:val="yellow"/>
-        </w:rPr>
-        <w:t xml:space="preserve">[Insertar captura: registro con edad «veinte» y con nota 25]</w:t>
+        <w:drawing>
+          <wp:inline distT="0" distB="0" distL="0" distR="0">
+            <wp:extent cx="5486400" cy="5362575"/>
+            <wp:effectExtent t="0" r="0" b="0" l="0"/>
+            <wp:docPr id="5" name=""/>
+            <wp:cNvGraphicFramePr>
+              <a:graphicFrameLocks xmlns:a="http://schemas.openxmlformats.org/drawingml/2006/main" noChangeAspect="1"/>
+            </wp:cNvGraphicFramePr>
+            <a:graphic xmlns:a="http://schemas.openxmlformats.org/drawingml/2006/main">
+              <a:graphicData uri="http://schemas.openxmlformats.org/drawingml/2006/picture">
+                <pic:pic xmlns:pic="http://schemas.openxmlformats.org/drawingml/2006/picture">
+                  <pic:nvPicPr>
+                    <pic:cNvPr id="0" name="" descr=""/>
+                    <pic:cNvPicPr>
+                      <a:picLocks noChangeAspect="1" noChangeArrowheads="1"/>
+                    </pic:cNvPicPr>
+                  </pic:nvPicPr>
+                  <pic:blipFill>
+                    <a:blip r:embed="rId15" cstate="none"/>
+                    <a:srcRect/>
+                    <a:stretch>
+                      <a:fillRect/>
+                    </a:stretch>
+                  </pic:blipFill>
+                  <pic:spPr bwMode="auto">
+                    <a:xfrm>
+                      <a:off x="0" y="0"/>
+                      <a:ext cx="5486400" cy="5362575"/>
+                    </a:xfrm>
+                    <a:prstGeom prst="rect">
+                      <a:avLst/>
+                    </a:prstGeom>
+                  </pic:spPr>
+                </pic:pic>
+              </a:graphicData>
+            </a:graphic>
+          </wp:inline>
+        </w:drawing>
       </w:r>
     </w:p>
     <w:p>
@@ -5946,7 +7942,7 @@
           <w:b/>
           <w:bCs/>
         </w:rPr>
-        <w:t xml:space="preserve">Figura 4</w:t>
+        <w:t xml:space="preserve">Figura 5</w:t>
       </w:r>
     </w:p>
     <w:p>
@@ -5964,21 +7960,48 @@
     </w:p>
     <w:p>
       <w:pPr>
-        <w:pBdr>
-          <w:top w:val="dashed" w:color="999999" w:sz="6" w:space="8"/>
-          <w:left w:val="dashed" w:color="999999" w:sz="6" w:space="8"/>
-          <w:bottom w:val="dashed" w:color="999999" w:sz="6" w:space="8"/>
-          <w:right w:val="dashed" w:color="999999" w:sz="6" w:space="8"/>
-        </w:pBdr>
         <w:spacing w:after="120" w:before="120"/>
         <w:jc w:val="center"/>
       </w:pPr>
       <w:r>
-        <w:rPr>
-          <w:rFonts w:ascii="Times New Roman" w:cs="Times New Roman" w:eastAsia="Times New Roman" w:hAnsi="Times New Roman"/>
-          <w:highlight w:val="yellow"/>
-        </w:rPr>
-        <w:t xml:space="preserve">[Insertar captura: registro_alumnos data/no_existe.csv]</w:t>
+        <w:drawing>
+          <wp:inline distT="0" distB="0" distL="0" distR="0">
+            <wp:extent cx="5486400" cy="3276600"/>
+            <wp:effectExtent t="0" r="0" b="0" l="0"/>
+            <wp:docPr id="6" name=""/>
+            <wp:cNvGraphicFramePr>
+              <a:graphicFrameLocks xmlns:a="http://schemas.openxmlformats.org/drawingml/2006/main" noChangeAspect="1"/>
+            </wp:cNvGraphicFramePr>
+            <a:graphic xmlns:a="http://schemas.openxmlformats.org/drawingml/2006/main">
+              <a:graphicData uri="http://schemas.openxmlformats.org/drawingml/2006/picture">
+                <pic:pic xmlns:pic="http://schemas.openxmlformats.org/drawingml/2006/picture">
+                  <pic:nvPicPr>
+                    <pic:cNvPr id="0" name="" descr=""/>
+                    <pic:cNvPicPr>
+                      <a:picLocks noChangeAspect="1" noChangeArrowheads="1"/>
+                    </pic:cNvPicPr>
+                  </pic:nvPicPr>
+                  <pic:blipFill>
+                    <a:blip r:embed="rId16" cstate="none"/>
+                    <a:srcRect/>
+                    <a:stretch>
+                      <a:fillRect/>
+                    </a:stretch>
+                  </pic:blipFill>
+                  <pic:spPr bwMode="auto">
+                    <a:xfrm>
+                      <a:off x="0" y="0"/>
+                      <a:ext cx="5486400" cy="3276600"/>
+                    </a:xfrm>
+                    <a:prstGeom prst="rect">
+                      <a:avLst/>
+                    </a:prstGeom>
+                  </pic:spPr>
+                </pic:pic>
+              </a:graphicData>
+            </a:graphic>
+          </wp:inline>
+        </w:drawing>
       </w:r>
     </w:p>
     <w:p>
@@ -6010,7 +8033,7 @@
           <w:b/>
           <w:bCs/>
         </w:rPr>
-        <w:t xml:space="preserve">Figura 5</w:t>
+        <w:t xml:space="preserve">Figura 6</w:t>
       </w:r>
     </w:p>
     <w:p>
@@ -6023,26 +8046,53 @@
           <w:i/>
           <w:iCs/>
         </w:rPr>
-        <w:t xml:space="preserve">Inicio del sistema con un archivo corrupto</w:t>
-      </w:r>
-    </w:p>
-    <w:p>
-      <w:pPr>
-        <w:pBdr>
-          <w:top w:val="dashed" w:color="999999" w:sz="6" w:space="8"/>
-          <w:left w:val="dashed" w:color="999999" w:sz="6" w:space="8"/>
-          <w:bottom w:val="dashed" w:color="999999" w:sz="6" w:space="8"/>
-          <w:right w:val="dashed" w:color="999999" w:sz="6" w:space="8"/>
-        </w:pBdr>
+        <w:t xml:space="preserve">Inicio del sistema con un archivo corrupto y registro en errores.log</w:t>
+      </w:r>
+    </w:p>
+    <w:p>
+      <w:pPr>
         <w:spacing w:after="120" w:before="120"/>
         <w:jc w:val="center"/>
       </w:pPr>
       <w:r>
-        <w:rPr>
-          <w:rFonts w:ascii="Times New Roman" w:cs="Times New Roman" w:eastAsia="Times New Roman" w:hAnsi="Times New Roman"/>
-          <w:highlight w:val="yellow"/>
-        </w:rPr>
-        <w:t xml:space="preserve">[Insertar captura: registro_alumnos data/alumnos_corrupto.csv, error con número de línea]</w:t>
+        <w:drawing>
+          <wp:inline distT="0" distB="0" distL="0" distR="0">
+            <wp:extent cx="5486400" cy="1819275"/>
+            <wp:effectExtent t="0" r="0" b="0" l="0"/>
+            <wp:docPr id="7" name=""/>
+            <wp:cNvGraphicFramePr>
+              <a:graphicFrameLocks xmlns:a="http://schemas.openxmlformats.org/drawingml/2006/main" noChangeAspect="1"/>
+            </wp:cNvGraphicFramePr>
+            <a:graphic xmlns:a="http://schemas.openxmlformats.org/drawingml/2006/main">
+              <a:graphicData uri="http://schemas.openxmlformats.org/drawingml/2006/picture">
+                <pic:pic xmlns:pic="http://schemas.openxmlformats.org/drawingml/2006/picture">
+                  <pic:nvPicPr>
+                    <pic:cNvPr id="0" name="" descr=""/>
+                    <pic:cNvPicPr>
+                      <a:picLocks noChangeAspect="1" noChangeArrowheads="1"/>
+                    </pic:cNvPicPr>
+                  </pic:nvPicPr>
+                  <pic:blipFill>
+                    <a:blip r:embed="rId17" cstate="none"/>
+                    <a:srcRect/>
+                    <a:stretch>
+                      <a:fillRect/>
+                    </a:stretch>
+                  </pic:blipFill>
+                  <pic:spPr bwMode="auto">
+                    <a:xfrm>
+                      <a:off x="0" y="0"/>
+                      <a:ext cx="5486400" cy="1819275"/>
+                    </a:xfrm>
+                    <a:prstGeom prst="rect">
+                      <a:avLst/>
+                    </a:prstGeom>
+                  </pic:spPr>
+                </pic:pic>
+              </a:graphicData>
+            </a:graphic>
+          </wp:inline>
+        </w:drawing>
       </w:r>
     </w:p>
     <w:p>
@@ -6074,7 +8124,7 @@
           <w:b/>
           <w:bCs/>
         </w:rPr>
-        <w:t xml:space="preserve">Figura 6</w:t>
+        <w:t xml:space="preserve">Figura 7</w:t>
       </w:r>
     </w:p>
     <w:p>
@@ -6087,26 +8137,53 @@
           <w:i/>
           <w:iCs/>
         </w:rPr>
-        <w:t xml:space="preserve">Búsqueda de un alumno inexistente</w:t>
-      </w:r>
-    </w:p>
-    <w:p>
-      <w:pPr>
-        <w:pBdr>
-          <w:top w:val="dashed" w:color="999999" w:sz="6" w:space="8"/>
-          <w:left w:val="dashed" w:color="999999" w:sz="6" w:space="8"/>
-          <w:bottom w:val="dashed" w:color="999999" w:sz="6" w:space="8"/>
-          <w:right w:val="dashed" w:color="999999" w:sz="6" w:space="8"/>
-        </w:pBdr>
+        <w:t xml:space="preserve">Búsqueda de un alumno existente y de uno inexistente</w:t>
+      </w:r>
+    </w:p>
+    <w:p>
+      <w:pPr>
         <w:spacing w:after="120" w:before="120"/>
         <w:jc w:val="center"/>
       </w:pPr>
       <w:r>
-        <w:rPr>
-          <w:rFonts w:ascii="Times New Roman" w:cs="Times New Roman" w:eastAsia="Times New Roman" w:hAnsi="Times New Roman"/>
-          <w:highlight w:val="yellow"/>
-        </w:rPr>
-        <w:t xml:space="preserve">[Insertar captura: búsqueda del código 99999999]</w:t>
+        <w:drawing>
+          <wp:inline distT="0" distB="0" distL="0" distR="0">
+            <wp:extent cx="5486400" cy="4895850"/>
+            <wp:effectExtent t="0" r="0" b="0" l="0"/>
+            <wp:docPr id="8" name=""/>
+            <wp:cNvGraphicFramePr>
+              <a:graphicFrameLocks xmlns:a="http://schemas.openxmlformats.org/drawingml/2006/main" noChangeAspect="1"/>
+            </wp:cNvGraphicFramePr>
+            <a:graphic xmlns:a="http://schemas.openxmlformats.org/drawingml/2006/main">
+              <a:graphicData uri="http://schemas.openxmlformats.org/drawingml/2006/picture">
+                <pic:pic xmlns:pic="http://schemas.openxmlformats.org/drawingml/2006/picture">
+                  <pic:nvPicPr>
+                    <pic:cNvPr id="0" name="" descr=""/>
+                    <pic:cNvPicPr>
+                      <a:picLocks noChangeAspect="1" noChangeArrowheads="1"/>
+                    </pic:cNvPicPr>
+                  </pic:nvPicPr>
+                  <pic:blipFill>
+                    <a:blip r:embed="rId18" cstate="none"/>
+                    <a:srcRect/>
+                    <a:stretch>
+                      <a:fillRect/>
+                    </a:stretch>
+                  </pic:blipFill>
+                  <pic:spPr bwMode="auto">
+                    <a:xfrm>
+                      <a:off x="0" y="0"/>
+                      <a:ext cx="5486400" cy="4895850"/>
+                    </a:xfrm>
+                    <a:prstGeom prst="rect">
+                      <a:avLst/>
+                    </a:prstGeom>
+                  </pic:spPr>
+                </pic:pic>
+              </a:graphicData>
+            </a:graphic>
+          </wp:inline>
+        </w:drawing>
       </w:r>
     </w:p>
     <w:p>
@@ -6138,7 +8215,7 @@
           <w:b/>
           <w:bCs/>
         </w:rPr>
-        <w:t xml:space="preserve">Figura 7</w:t>
+        <w:t xml:space="preserve">Figura 8</w:t>
       </w:r>
     </w:p>
     <w:p>
@@ -6156,21 +8233,48 @@
     </w:p>
     <w:p>
       <w:pPr>
-        <w:pBdr>
-          <w:top w:val="dashed" w:color="999999" w:sz="6" w:space="8"/>
-          <w:left w:val="dashed" w:color="999999" w:sz="6" w:space="8"/>
-          <w:bottom w:val="dashed" w:color="999999" w:sz="6" w:space="8"/>
-          <w:right w:val="dashed" w:color="999999" w:sz="6" w:space="8"/>
-        </w:pBdr>
         <w:spacing w:after="120" w:before="120"/>
         <w:jc w:val="center"/>
       </w:pPr>
       <w:r>
-        <w:rPr>
-          <w:rFonts w:ascii="Times New Roman" w:cs="Times New Roman" w:eastAsia="Times New Roman" w:hAnsi="Times New Roman"/>
-          <w:highlight w:val="yellow"/>
-        </w:rPr>
-        <w:t xml:space="preserve">[Insertar captura: registro del código 20231001, que ya existe]</w:t>
+        <w:drawing>
+          <wp:inline distT="0" distB="0" distL="0" distR="0">
+            <wp:extent cx="5486400" cy="3733800"/>
+            <wp:effectExtent t="0" r="0" b="0" l="0"/>
+            <wp:docPr id="9" name=""/>
+            <wp:cNvGraphicFramePr>
+              <a:graphicFrameLocks xmlns:a="http://schemas.openxmlformats.org/drawingml/2006/main" noChangeAspect="1"/>
+            </wp:cNvGraphicFramePr>
+            <a:graphic xmlns:a="http://schemas.openxmlformats.org/drawingml/2006/main">
+              <a:graphicData uri="http://schemas.openxmlformats.org/drawingml/2006/picture">
+                <pic:pic xmlns:pic="http://schemas.openxmlformats.org/drawingml/2006/picture">
+                  <pic:nvPicPr>
+                    <pic:cNvPr id="0" name="" descr=""/>
+                    <pic:cNvPicPr>
+                      <a:picLocks noChangeAspect="1" noChangeArrowheads="1"/>
+                    </pic:cNvPicPr>
+                  </pic:nvPicPr>
+                  <pic:blipFill>
+                    <a:blip r:embed="rId19" cstate="none"/>
+                    <a:srcRect/>
+                    <a:stretch>
+                      <a:fillRect/>
+                    </a:stretch>
+                  </pic:blipFill>
+                  <pic:spPr bwMode="auto">
+                    <a:xfrm>
+                      <a:off x="0" y="0"/>
+                      <a:ext cx="5486400" cy="3733800"/>
+                    </a:xfrm>
+                    <a:prstGeom prst="rect">
+                      <a:avLst/>
+                    </a:prstGeom>
+                  </pic:spPr>
+                </pic:pic>
+              </a:graphicData>
+            </a:graphic>
+          </wp:inline>
+        </w:drawing>
       </w:r>
     </w:p>
     <w:p>
@@ -6202,7 +8306,7 @@
           <w:b/>
           <w:bCs/>
         </w:rPr>
-        <w:t xml:space="preserve">Figura 8</w:t>
+        <w:t xml:space="preserve">Figura 9</w:t>
       </w:r>
     </w:p>
     <w:p>
@@ -6215,26 +8319,53 @@
           <w:i/>
           <w:iCs/>
         </w:rPr>
-        <w:t xml:space="preserve">Flujo completo sin errores</w:t>
-      </w:r>
-    </w:p>
-    <w:p>
-      <w:pPr>
-        <w:pBdr>
-          <w:top w:val="dashed" w:color="999999" w:sz="6" w:space="8"/>
-          <w:left w:val="dashed" w:color="999999" w:sz="6" w:space="8"/>
-          <w:bottom w:val="dashed" w:color="999999" w:sz="6" w:space="8"/>
-          <w:right w:val="dashed" w:color="999999" w:sz="6" w:space="8"/>
-        </w:pBdr>
+        <w:t xml:space="preserve">Flujo completo: registrar, eliminar, listar y guardar</w:t>
+      </w:r>
+    </w:p>
+    <w:p>
+      <w:pPr>
         <w:spacing w:after="120" w:before="120"/>
         <w:jc w:val="center"/>
       </w:pPr>
       <w:r>
-        <w:rPr>
-          <w:rFonts w:ascii="Times New Roman" w:cs="Times New Roman" w:eastAsia="Times New Roman" w:hAnsi="Times New Roman"/>
-          <w:highlight w:val="yellow"/>
-        </w:rPr>
-        <w:t xml:space="preserve">[Insertar captura: registrar, listar, buscar, guardar y eliminar]</w:t>
+        <w:drawing>
+          <wp:inline distT="0" distB="0" distL="0" distR="0">
+            <wp:extent cx="4857750" cy="7620000"/>
+            <wp:effectExtent t="0" r="0" b="0" l="0"/>
+            <wp:docPr id="10" name=""/>
+            <wp:cNvGraphicFramePr>
+              <a:graphicFrameLocks xmlns:a="http://schemas.openxmlformats.org/drawingml/2006/main" noChangeAspect="1"/>
+            </wp:cNvGraphicFramePr>
+            <a:graphic xmlns:a="http://schemas.openxmlformats.org/drawingml/2006/main">
+              <a:graphicData uri="http://schemas.openxmlformats.org/drawingml/2006/picture">
+                <pic:pic xmlns:pic="http://schemas.openxmlformats.org/drawingml/2006/picture">
+                  <pic:nvPicPr>
+                    <pic:cNvPr id="0" name="" descr=""/>
+                    <pic:cNvPicPr>
+                      <a:picLocks noChangeAspect="1" noChangeArrowheads="1"/>
+                    </pic:cNvPicPr>
+                  </pic:nvPicPr>
+                  <pic:blipFill>
+                    <a:blip r:embed="rId20" cstate="none"/>
+                    <a:srcRect/>
+                    <a:stretch>
+                      <a:fillRect/>
+                    </a:stretch>
+                  </pic:blipFill>
+                  <pic:spPr bwMode="auto">
+                    <a:xfrm>
+                      <a:off x="0" y="0"/>
+                      <a:ext cx="4857750" cy="7620000"/>
+                    </a:xfrm>
+                    <a:prstGeom prst="rect">
+                      <a:avLst/>
+                    </a:prstGeom>
+                  </pic:spPr>
+                </pic:pic>
+              </a:graphicData>
+            </a:graphic>
+          </wp:inline>
+        </w:drawing>
       </w:r>
     </w:p>
     <w:p>

</xml_diff>

<commit_message>
docs: actualizar informe con el código y las capturas del sistema integrado
</commit_message>
<xml_diff>
--- a/informe/Informe_PRAC02_Manejo_de_Errores_Grupo1.docx
+++ b/informe/Informe_PRAC02_Manejo_de_Errores_Grupo1.docx
@@ -165,7 +165,7 @@
         <w:spacing w:after="300"/>
         <w:jc w:val="center"/>
       </w:pPr>
-      <w:hyperlink w:history="1" r:id="rIdygi7ppyxqfcshvxdse-vg">
+      <w:hyperlink w:history="1" r:id="rIds8sjyblfu3ucb425ortb2">
         <w:r>
           <w:rPr>
             <w:rStyle w:val="Hyperlink"/>
@@ -808,7 +808,7 @@
         </w:rPr>
         <w:t xml:space="preserve">El presente informe documenta la Práctica 02 del curso Tecnología de Objetos, desarrollada por el Grupo 1 en el lenguaje C++. Comprende dos actividades: la Práctica 1, División segura, y la Simulación de sistema, común a todos los grupos, en la que se construyó un sistema de registro de alumnos que integra el manejo de errores de entrada de datos, de archivos no encontrados o corruptos y de excepciones personalizadas. El código fuente se encuentra en el repositorio del grupo: </w:t>
       </w:r>
-      <w:hyperlink w:history="1" r:id="rIdn0pysltq1xstiebz-29ob">
+      <w:hyperlink w:history="1" r:id="rIdyrd0w1z6ouxu2qzzxtkfq">
         <w:r>
           <w:rPr>
             <w:rStyle w:val="Hyperlink"/>
@@ -4871,6 +4871,36 @@
           <w:sz w:val="18"/>
           <w:szCs w:val="18"/>
         </w:rPr>
+        <w:t xml:space="preserve">// Responsable: Gabriel</w:t>
+      </w:r>
+    </w:p>
+    <w:p>
+      <w:pPr>
+        <w:shd w:fill="F2F2F2" w:color="auto" w:val="clear"/>
+        <w:spacing w:after="0" w:before="0" w:line="240"/>
+        <w:ind w:left="360"/>
+      </w:pPr>
+      <w:r>
+        <w:rPr>
+          <w:rFonts w:ascii="Consolas" w:cs="Consolas" w:eastAsia="Consolas" w:hAnsi="Consolas"/>
+          <w:sz w:val="18"/>
+          <w:szCs w:val="18"/>
+        </w:rPr>
+        <w:t xml:space="preserve">// Cada excepción conserva un mensaje descriptivo, disponible mediante what().</w:t>
+      </w:r>
+    </w:p>
+    <w:p>
+      <w:pPr>
+        <w:shd w:fill="F2F2F2" w:color="auto" w:val="clear"/>
+        <w:spacing w:after="0" w:before="0" w:line="240"/>
+        <w:ind w:left="360"/>
+      </w:pPr>
+      <w:r>
+        <w:rPr>
+          <w:rFonts w:ascii="Consolas" w:cs="Consolas" w:eastAsia="Consolas" w:hAnsi="Consolas"/>
+          <w:sz w:val="18"/>
+          <w:szCs w:val="18"/>
+        </w:rPr>
         <w:t xml:space="preserve">RegistroException::RegistroException(const std::string&amp; mensaje)</w:t>
       </w:r>
     </w:p>
@@ -4916,7 +4946,22 @@
           <w:sz w:val="18"/>
           <w:szCs w:val="18"/>
         </w:rPr>
-        <w:t xml:space="preserve">EntradaInvalidaException::EntradaInvalidaException(const std::string&amp; campo, const std::string&amp; detalle)</w:t>
+        <w:t xml:space="preserve">EntradaInvalidaException::EntradaInvalidaException(const std::string&amp; campo,</w:t>
+      </w:r>
+    </w:p>
+    <w:p>
+      <w:pPr>
+        <w:shd w:fill="F2F2F2" w:color="auto" w:val="clear"/>
+        <w:spacing w:after="0" w:before="0" w:line="240"/>
+        <w:ind w:left="360"/>
+      </w:pPr>
+      <w:r>
+        <w:rPr>
+          <w:rFonts w:ascii="Consolas" w:cs="Consolas" w:eastAsia="Consolas" w:hAnsi="Consolas"/>
+          <w:sz w:val="18"/>
+          <w:szCs w:val="18"/>
+        </w:rPr>
+        <w:t xml:space="preserve">                                                 const std::string&amp; detalle)</w:t>
       </w:r>
     </w:p>
     <w:p>
@@ -5036,37 +5081,52 @@
           <w:sz w:val="18"/>
           <w:szCs w:val="18"/>
         </w:rPr>
-        <w:t xml:space="preserve">ArchivoCorruptoException::ArchivoCorruptoException(const std::string&amp; ruta, int linea, const std::string&amp; detalle)</w:t>
-      </w:r>
-    </w:p>
-    <w:p>
-      <w:pPr>
-        <w:shd w:fill="F2F2F2" w:color="auto" w:val="clear"/>
-        <w:spacing w:after="0" w:before="0" w:line="240"/>
-        <w:ind w:left="360"/>
-      </w:pPr>
-      <w:r>
-        <w:rPr>
-          <w:rFonts w:ascii="Consolas" w:cs="Consolas" w:eastAsia="Consolas" w:hAnsi="Consolas"/>
-          <w:sz w:val="18"/>
-          <w:szCs w:val="18"/>
-        </w:rPr>
-        <w:t xml:space="preserve">    : RegistroException("El archivo " + ruta + " está dañado en la línea " + std::to_string(linea) + ": " + detalle),</w:t>
-      </w:r>
-    </w:p>
-    <w:p>
-      <w:pPr>
-        <w:shd w:fill="F2F2F2" w:color="auto" w:val="clear"/>
-        <w:spacing w:after="0" w:before="0" w:line="240"/>
-        <w:ind w:left="360"/>
-      </w:pPr>
-      <w:r>
-        <w:rPr>
-          <w:rFonts w:ascii="Consolas" w:cs="Consolas" w:eastAsia="Consolas" w:hAnsi="Consolas"/>
-          <w:sz w:val="18"/>
-          <w:szCs w:val="18"/>
-        </w:rPr>
-        <w:t xml:space="preserve">      linea_(linea) {}</w:t>
+        <w:t xml:space="preserve">ArchivoCorruptoException::ArchivoCorruptoException(const std::string&amp; ruta, int linea,</w:t>
+      </w:r>
+    </w:p>
+    <w:p>
+      <w:pPr>
+        <w:shd w:fill="F2F2F2" w:color="auto" w:val="clear"/>
+        <w:spacing w:after="0" w:before="0" w:line="240"/>
+        <w:ind w:left="360"/>
+      </w:pPr>
+      <w:r>
+        <w:rPr>
+          <w:rFonts w:ascii="Consolas" w:cs="Consolas" w:eastAsia="Consolas" w:hAnsi="Consolas"/>
+          <w:sz w:val="18"/>
+          <w:szCs w:val="18"/>
+        </w:rPr>
+        <w:t xml:space="preserve">                                                 const std::string&amp; detalle)</w:t>
+      </w:r>
+    </w:p>
+    <w:p>
+      <w:pPr>
+        <w:shd w:fill="F2F2F2" w:color="auto" w:val="clear"/>
+        <w:spacing w:after="0" w:before="0" w:line="240"/>
+        <w:ind w:left="360"/>
+      </w:pPr>
+      <w:r>
+        <w:rPr>
+          <w:rFonts w:ascii="Consolas" w:cs="Consolas" w:eastAsia="Consolas" w:hAnsi="Consolas"/>
+          <w:sz w:val="18"/>
+          <w:szCs w:val="18"/>
+        </w:rPr>
+        <w:t xml:space="preserve">    : RegistroException("El archivo " + ruta + " está dañado en la línea "</w:t>
+      </w:r>
+    </w:p>
+    <w:p>
+      <w:pPr>
+        <w:shd w:fill="F2F2F2" w:color="auto" w:val="clear"/>
+        <w:spacing w:after="0" w:before="0" w:line="240"/>
+        <w:ind w:left="360"/>
+      </w:pPr>
+      <w:r>
+        <w:rPr>
+          <w:rFonts w:ascii="Consolas" w:cs="Consolas" w:eastAsia="Consolas" w:hAnsi="Consolas"/>
+          <w:sz w:val="18"/>
+          <w:szCs w:val="18"/>
+        </w:rPr>
+        <w:t xml:space="preserve">                        + std::to_string(linea) + ": " + detalle), linea_(linea) {}</w:t>
       </w:r>
     </w:p>
     <w:p>
@@ -5228,6 +5288,21 @@
           <w:sz w:val="18"/>
           <w:szCs w:val="18"/>
         </w:rPr>
+        <w:t xml:space="preserve">    std::size_t pos = 0;</w:t>
+      </w:r>
+    </w:p>
+    <w:p>
+      <w:pPr>
+        <w:shd w:fill="F2F2F2" w:color="auto" w:val="clear"/>
+        <w:spacing w:after="0" w:before="0" w:line="240"/>
+        <w:ind w:left="360"/>
+      </w:pPr>
+      <w:r>
+        <w:rPr>
+          <w:rFonts w:ascii="Consolas" w:cs="Consolas" w:eastAsia="Consolas" w:hAnsi="Consolas"/>
+          <w:sz w:val="18"/>
+          <w:szCs w:val="18"/>
+        </w:rPr>
         <w:t xml:space="preserve">    int valor = 0;</w:t>
       </w:r>
     </w:p>
@@ -5243,7 +5318,7 @@
           <w:sz w:val="18"/>
           <w:szCs w:val="18"/>
         </w:rPr>
-        <w:t xml:space="preserve">    std::size_t pos = 0;</w:t>
+        <w:t xml:space="preserve"> </w:t>
       </w:r>
     </w:p>
     <w:p>
@@ -5303,7 +5378,7 @@
           <w:sz w:val="18"/>
           <w:szCs w:val="18"/>
         </w:rPr>
-        <w:t xml:space="preserve">        throw EntradaInvalidaException(campo, "debe ser un número entero");</w:t>
+        <w:t xml:space="preserve">        throw EntradaInvalidaException(campo, "El valor ingresado no es un numero entero valido");</w:t>
       </w:r>
     </w:p>
     <w:p>
@@ -5333,7 +5408,7 @@
           <w:sz w:val="18"/>
           <w:szCs w:val="18"/>
         </w:rPr>
-        <w:t xml:space="preserve">        throw EntradaInvalidaException(campo, "el número es demasiado grande");</w:t>
+        <w:t xml:space="preserve">        throw EntradaInvalidaException(campo, "El numero ingresado esta fuera del rango soportado");</w:t>
       </w:r>
     </w:p>
     <w:p>
@@ -5363,6 +5438,21 @@
           <w:sz w:val="18"/>
           <w:szCs w:val="18"/>
         </w:rPr>
+        <w:t xml:space="preserve"> </w:t>
+      </w:r>
+    </w:p>
+    <w:p>
+      <w:pPr>
+        <w:shd w:fill="F2F2F2" w:color="auto" w:val="clear"/>
+        <w:spacing w:after="0" w:before="0" w:line="240"/>
+        <w:ind w:left="360"/>
+      </w:pPr>
+      <w:r>
+        <w:rPr>
+          <w:rFonts w:ascii="Consolas" w:cs="Consolas" w:eastAsia="Consolas" w:hAnsi="Consolas"/>
+          <w:sz w:val="18"/>
+          <w:szCs w:val="18"/>
+        </w:rPr>
         <w:t xml:space="preserve">    if (pos != texto.size()) {</w:t>
       </w:r>
     </w:p>
@@ -5378,7 +5468,7 @@
           <w:sz w:val="18"/>
           <w:szCs w:val="18"/>
         </w:rPr>
-        <w:t xml:space="preserve">        throw EntradaInvalidaException(campo, "debe ser un número entero");</w:t>
+        <w:t xml:space="preserve">        throw EntradaInvalidaException(campo, "El texto contiene caracteres no validos");</w:t>
       </w:r>
     </w:p>
     <w:p>
@@ -5408,6 +5498,21 @@
           <w:sz w:val="18"/>
           <w:szCs w:val="18"/>
         </w:rPr>
+        <w:t xml:space="preserve"> </w:t>
+      </w:r>
+    </w:p>
+    <w:p>
+      <w:pPr>
+        <w:shd w:fill="F2F2F2" w:color="auto" w:val="clear"/>
+        <w:spacing w:after="0" w:before="0" w:line="240"/>
+        <w:ind w:left="360"/>
+      </w:pPr>
+      <w:r>
+        <w:rPr>
+          <w:rFonts w:ascii="Consolas" w:cs="Consolas" w:eastAsia="Consolas" w:hAnsi="Consolas"/>
+          <w:sz w:val="18"/>
+          <w:szCs w:val="18"/>
+        </w:rPr>
         <w:t xml:space="preserve">    if (valor &lt; min || valor &gt; max) {</w:t>
       </w:r>
     </w:p>
@@ -5423,7 +5528,7 @@
           <w:sz w:val="18"/>
           <w:szCs w:val="18"/>
         </w:rPr>
-        <w:t xml:space="preserve">        throw EntradaInvalidaException(campo, "debe estar entre " + std::to_string(min) + " y " + std::to_string(max));</w:t>
+        <w:t xml:space="preserve">        throw EntradaInvalidaException(campo, "El valor debe estar entre " + std::to_string(min) + " y " + std::to_string(max));</w:t>
       </w:r>
     </w:p>
     <w:p>
@@ -5439,6 +5544,21 @@
           <w:szCs w:val="18"/>
         </w:rPr>
         <w:t xml:space="preserve">    }</w:t>
+      </w:r>
+    </w:p>
+    <w:p>
+      <w:pPr>
+        <w:shd w:fill="F2F2F2" w:color="auto" w:val="clear"/>
+        <w:spacing w:after="0" w:before="0" w:line="240"/>
+        <w:ind w:left="360"/>
+      </w:pPr>
+      <w:r>
+        <w:rPr>
+          <w:rFonts w:ascii="Consolas" w:cs="Consolas" w:eastAsia="Consolas" w:hAnsi="Consolas"/>
+          <w:sz w:val="18"/>
+          <w:szCs w:val="18"/>
+        </w:rPr>
+        <w:t xml:space="preserve"> </w:t>
       </w:r>
     </w:p>
     <w:p>
@@ -5525,7 +5645,7 @@
           <w:sz w:val="18"/>
           <w:szCs w:val="18"/>
         </w:rPr>
-        <w:t xml:space="preserve">    if (!archivo) {</w:t>
+        <w:t xml:space="preserve">    if (!archivo.is_open()) {</w:t>
       </w:r>
     </w:p>
     <w:p>
@@ -5570,6 +5690,21 @@
           <w:sz w:val="18"/>
           <w:szCs w:val="18"/>
         </w:rPr>
+        <w:t xml:space="preserve"> </w:t>
+      </w:r>
+    </w:p>
+    <w:p>
+      <w:pPr>
+        <w:shd w:fill="F2F2F2" w:color="auto" w:val="clear"/>
+        <w:spacing w:after="0" w:before="0" w:line="240"/>
+        <w:ind w:left="360"/>
+      </w:pPr>
+      <w:r>
+        <w:rPr>
+          <w:rFonts w:ascii="Consolas" w:cs="Consolas" w:eastAsia="Consolas" w:hAnsi="Consolas"/>
+          <w:sz w:val="18"/>
+          <w:szCs w:val="18"/>
+        </w:rPr>
         <w:t xml:space="preserve">    std::vector&lt;Alumno&gt; alumnos;</w:t>
       </w:r>
     </w:p>
@@ -5600,7 +5735,22 @@
           <w:sz w:val="18"/>
           <w:szCs w:val="18"/>
         </w:rPr>
-        <w:t xml:space="preserve">    int numero = 0;</w:t>
+        <w:t xml:space="preserve">    int numeroLinea = 0;</w:t>
+      </w:r>
+    </w:p>
+    <w:p>
+      <w:pPr>
+        <w:shd w:fill="F2F2F2" w:color="auto" w:val="clear"/>
+        <w:spacing w:after="0" w:before="0" w:line="240"/>
+        <w:ind w:left="360"/>
+      </w:pPr>
+      <w:r>
+        <w:rPr>
+          <w:rFonts w:ascii="Consolas" w:cs="Consolas" w:eastAsia="Consolas" w:hAnsi="Consolas"/>
+          <w:sz w:val="18"/>
+          <w:szCs w:val="18"/>
+        </w:rPr>
+        <w:t xml:space="preserve"> </w:t>
       </w:r>
     </w:p>
     <w:p>
@@ -5630,22 +5780,82 @@
           <w:sz w:val="18"/>
           <w:szCs w:val="18"/>
         </w:rPr>
-        <w:t xml:space="preserve">        ++numero;</w:t>
-      </w:r>
-    </w:p>
-    <w:p>
-      <w:pPr>
-        <w:shd w:fill="F2F2F2" w:color="auto" w:val="clear"/>
-        <w:spacing w:after="0" w:before="0" w:line="240"/>
-        <w:ind w:left="360"/>
-      </w:pPr>
-      <w:r>
-        <w:rPr>
-          <w:rFonts w:ascii="Consolas" w:cs="Consolas" w:eastAsia="Consolas" w:hAnsi="Consolas"/>
-          <w:sz w:val="18"/>
-          <w:szCs w:val="18"/>
-        </w:rPr>
-        <w:t xml:space="preserve">        if (linea.empty() || linea[0] == '#') {</w:t>
+        <w:t xml:space="preserve">        numeroLinea++;</w:t>
+      </w:r>
+    </w:p>
+    <w:p>
+      <w:pPr>
+        <w:shd w:fill="F2F2F2" w:color="auto" w:val="clear"/>
+        <w:spacing w:after="0" w:before="0" w:line="240"/>
+        <w:ind w:left="360"/>
+      </w:pPr>
+      <w:r>
+        <w:rPr>
+          <w:rFonts w:ascii="Consolas" w:cs="Consolas" w:eastAsia="Consolas" w:hAnsi="Consolas"/>
+          <w:sz w:val="18"/>
+          <w:szCs w:val="18"/>
+        </w:rPr>
+        <w:t xml:space="preserve"> </w:t>
+      </w:r>
+    </w:p>
+    <w:p>
+      <w:pPr>
+        <w:shd w:fill="F2F2F2" w:color="auto" w:val="clear"/>
+        <w:spacing w:after="0" w:before="0" w:line="240"/>
+        <w:ind w:left="360"/>
+      </w:pPr>
+      <w:r>
+        <w:rPr>
+          <w:rFonts w:ascii="Consolas" w:cs="Consolas" w:eastAsia="Consolas" w:hAnsi="Consolas"/>
+          <w:sz w:val="18"/>
+          <w:szCs w:val="18"/>
+        </w:rPr>
+        <w:t xml:space="preserve">        // Ignorar líneas vacías o comentarios que empiezan con '#' </w:t>
+      </w:r>
+    </w:p>
+    <w:p>
+      <w:pPr>
+        <w:shd w:fill="F2F2F2" w:color="auto" w:val="clear"/>
+        <w:spacing w:after="0" w:before="0" w:line="240"/>
+        <w:ind w:left="360"/>
+      </w:pPr>
+      <w:r>
+        <w:rPr>
+          <w:rFonts w:ascii="Consolas" w:cs="Consolas" w:eastAsia="Consolas" w:hAnsi="Consolas"/>
+          <w:sz w:val="18"/>
+          <w:szCs w:val="18"/>
+        </w:rPr>
+        <w:t xml:space="preserve">        // (omitiendo espacios en blanco iniciales si los hubiera)</w:t>
+      </w:r>
+    </w:p>
+    <w:p>
+      <w:pPr>
+        <w:shd w:fill="F2F2F2" w:color="auto" w:val="clear"/>
+        <w:spacing w:after="0" w:before="0" w:line="240"/>
+        <w:ind w:left="360"/>
+      </w:pPr>
+      <w:r>
+        <w:rPr>
+          <w:rFonts w:ascii="Consolas" w:cs="Consolas" w:eastAsia="Consolas" w:hAnsi="Consolas"/>
+          <w:sz w:val="18"/>
+          <w:szCs w:val="18"/>
+        </w:rPr>
+        <w:t xml:space="preserve">        size_t inicio = linea.find_first_not_of(" \t\r\n");</w:t>
+      </w:r>
+    </w:p>
+    <w:p>
+      <w:pPr>
+        <w:shd w:fill="F2F2F2" w:color="auto" w:val="clear"/>
+        <w:spacing w:after="0" w:before="0" w:line="240"/>
+        <w:ind w:left="360"/>
+      </w:pPr>
+      <w:r>
+        <w:rPr>
+          <w:rFonts w:ascii="Consolas" w:cs="Consolas" w:eastAsia="Consolas" w:hAnsi="Consolas"/>
+          <w:sz w:val="18"/>
+          <w:szCs w:val="18"/>
+        </w:rPr>
+        <w:t xml:space="preserve">        if (inicio == std::string::npos || linea[inicio] == '#') {</w:t>
       </w:r>
     </w:p>
     <w:p>
@@ -5690,6 +5900,51 @@
           <w:sz w:val="18"/>
           <w:szCs w:val="18"/>
         </w:rPr>
+        <w:t xml:space="preserve"> </w:t>
+      </w:r>
+    </w:p>
+    <w:p>
+      <w:pPr>
+        <w:shd w:fill="F2F2F2" w:color="auto" w:val="clear"/>
+        <w:spacing w:after="0" w:before="0" w:line="240"/>
+        <w:ind w:left="360"/>
+      </w:pPr>
+      <w:r>
+        <w:rPr>
+          <w:rFonts w:ascii="Consolas" w:cs="Consolas" w:eastAsia="Consolas" w:hAnsi="Consolas"/>
+          <w:sz w:val="18"/>
+          <w:szCs w:val="18"/>
+        </w:rPr>
+        <w:t xml:space="preserve">        std::stringstream ss(linea);</w:t>
+      </w:r>
+    </w:p>
+    <w:p>
+      <w:pPr>
+        <w:shd w:fill="F2F2F2" w:color="auto" w:val="clear"/>
+        <w:spacing w:after="0" w:before="0" w:line="240"/>
+        <w:ind w:left="360"/>
+      </w:pPr>
+      <w:r>
+        <w:rPr>
+          <w:rFonts w:ascii="Consolas" w:cs="Consolas" w:eastAsia="Consolas" w:hAnsi="Consolas"/>
+          <w:sz w:val="18"/>
+          <w:szCs w:val="18"/>
+        </w:rPr>
+        <w:t xml:space="preserve">        std::string campo;</w:t>
+      </w:r>
+    </w:p>
+    <w:p>
+      <w:pPr>
+        <w:shd w:fill="F2F2F2" w:color="auto" w:val="clear"/>
+        <w:spacing w:after="0" w:before="0" w:line="240"/>
+        <w:ind w:left="360"/>
+      </w:pPr>
+      <w:r>
+        <w:rPr>
+          <w:rFonts w:ascii="Consolas" w:cs="Consolas" w:eastAsia="Consolas" w:hAnsi="Consolas"/>
+          <w:sz w:val="18"/>
+          <w:szCs w:val="18"/>
+        </w:rPr>
         <w:t xml:space="preserve">        std::vector&lt;std::string&gt; campos;</w:t>
       </w:r>
     </w:p>
@@ -5705,37 +5960,22 @@
           <w:sz w:val="18"/>
           <w:szCs w:val="18"/>
         </w:rPr>
-        <w:t xml:space="preserve">        std::stringstream partes(linea);</w:t>
-      </w:r>
-    </w:p>
-    <w:p>
-      <w:pPr>
-        <w:shd w:fill="F2F2F2" w:color="auto" w:val="clear"/>
-        <w:spacing w:after="0" w:before="0" w:line="240"/>
-        <w:ind w:left="360"/>
-      </w:pPr>
-      <w:r>
-        <w:rPr>
-          <w:rFonts w:ascii="Consolas" w:cs="Consolas" w:eastAsia="Consolas" w:hAnsi="Consolas"/>
-          <w:sz w:val="18"/>
-          <w:szCs w:val="18"/>
-        </w:rPr>
-        <w:t xml:space="preserve">        std::string campo;</w:t>
-      </w:r>
-    </w:p>
-    <w:p>
-      <w:pPr>
-        <w:shd w:fill="F2F2F2" w:color="auto" w:val="clear"/>
-        <w:spacing w:after="0" w:before="0" w:line="240"/>
-        <w:ind w:left="360"/>
-      </w:pPr>
-      <w:r>
-        <w:rPr>
-          <w:rFonts w:ascii="Consolas" w:cs="Consolas" w:eastAsia="Consolas" w:hAnsi="Consolas"/>
-          <w:sz w:val="18"/>
-          <w:szCs w:val="18"/>
-        </w:rPr>
-        <w:t xml:space="preserve">        while (std::getline(partes, campo, ';')) {</w:t>
+        <w:t xml:space="preserve"> </w:t>
+      </w:r>
+    </w:p>
+    <w:p>
+      <w:pPr>
+        <w:shd w:fill="F2F2F2" w:color="auto" w:val="clear"/>
+        <w:spacing w:after="0" w:before="0" w:line="240"/>
+        <w:ind w:left="360"/>
+      </w:pPr>
+      <w:r>
+        <w:rPr>
+          <w:rFonts w:ascii="Consolas" w:cs="Consolas" w:eastAsia="Consolas" w:hAnsi="Consolas"/>
+          <w:sz w:val="18"/>
+          <w:szCs w:val="18"/>
+        </w:rPr>
+        <w:t xml:space="preserve">        while (std::getline(ss, campo, ';')) {</w:t>
       </w:r>
     </w:p>
     <w:p>
@@ -5780,6 +6020,21 @@
           <w:sz w:val="18"/>
           <w:szCs w:val="18"/>
         </w:rPr>
+        <w:t xml:space="preserve"> </w:t>
+      </w:r>
+    </w:p>
+    <w:p>
+      <w:pPr>
+        <w:shd w:fill="F2F2F2" w:color="auto" w:val="clear"/>
+        <w:spacing w:after="0" w:before="0" w:line="240"/>
+        <w:ind w:left="360"/>
+      </w:pPr>
+      <w:r>
+        <w:rPr>
+          <w:rFonts w:ascii="Consolas" w:cs="Consolas" w:eastAsia="Consolas" w:hAnsi="Consolas"/>
+          <w:sz w:val="18"/>
+          <w:szCs w:val="18"/>
+        </w:rPr>
         <w:t xml:space="preserve">        if (campos.size() != 4) {</w:t>
       </w:r>
     </w:p>
@@ -5795,7 +6050,7 @@
           <w:sz w:val="18"/>
           <w:szCs w:val="18"/>
         </w:rPr>
-        <w:t xml:space="preserve">            throw ArchivoCorruptoException(ruta, numero, "se esperaban 4 campos");</w:t>
+        <w:t xml:space="preserve">            throw ArchivoCorruptoException(ruta, numeroLinea, "se esperaban 4 campos");</w:t>
       </w:r>
     </w:p>
     <w:p>
@@ -5825,6 +6080,21 @@
           <w:sz w:val="18"/>
           <w:szCs w:val="18"/>
         </w:rPr>
+        <w:t xml:space="preserve"> </w:t>
+      </w:r>
+    </w:p>
+    <w:p>
+      <w:pPr>
+        <w:shd w:fill="F2F2F2" w:color="auto" w:val="clear"/>
+        <w:spacing w:after="0" w:before="0" w:line="240"/>
+        <w:ind w:left="360"/>
+      </w:pPr>
+      <w:r>
+        <w:rPr>
+          <w:rFonts w:ascii="Consolas" w:cs="Consolas" w:eastAsia="Consolas" w:hAnsi="Consolas"/>
+          <w:sz w:val="18"/>
+          <w:szCs w:val="18"/>
+        </w:rPr>
         <w:t xml:space="preserve">        try {</w:t>
       </w:r>
     </w:p>
@@ -5840,6 +6110,21 @@
           <w:sz w:val="18"/>
           <w:szCs w:val="18"/>
         </w:rPr>
+        <w:t xml:space="preserve">            // Validar cada campo usando las funciones de entrada.h.</w:t>
+      </w:r>
+    </w:p>
+    <w:p>
+      <w:pPr>
+        <w:shd w:fill="F2F2F2" w:color="auto" w:val="clear"/>
+        <w:spacing w:after="0" w:before="0" w:line="240"/>
+        <w:ind w:left="360"/>
+      </w:pPr>
+      <w:r>
+        <w:rPr>
+          <w:rFonts w:ascii="Consolas" w:cs="Consolas" w:eastAsia="Consolas" w:hAnsi="Consolas"/>
+          <w:sz w:val="18"/>
+          <w:szCs w:val="18"/>
+        </w:rPr>
         <w:t xml:space="preserve">            Alumno alumno;</w:t>
       </w:r>
     </w:p>
@@ -5915,6 +6200,21 @@
           <w:sz w:val="18"/>
           <w:szCs w:val="18"/>
         </w:rPr>
+        <w:t xml:space="preserve"> </w:t>
+      </w:r>
+    </w:p>
+    <w:p>
+      <w:pPr>
+        <w:shd w:fill="F2F2F2" w:color="auto" w:val="clear"/>
+        <w:spacing w:after="0" w:before="0" w:line="240"/>
+        <w:ind w:left="360"/>
+      </w:pPr>
+      <w:r>
+        <w:rPr>
+          <w:rFonts w:ascii="Consolas" w:cs="Consolas" w:eastAsia="Consolas" w:hAnsi="Consolas"/>
+          <w:sz w:val="18"/>
+          <w:szCs w:val="18"/>
+        </w:rPr>
         <w:t xml:space="preserve">            alumnos.push_back(alumno);</w:t>
       </w:r>
     </w:p>
@@ -5930,6 +6230,21 @@
           <w:sz w:val="18"/>
           <w:szCs w:val="18"/>
         </w:rPr>
+        <w:t xml:space="preserve"> </w:t>
+      </w:r>
+    </w:p>
+    <w:p>
+      <w:pPr>
+        <w:shd w:fill="F2F2F2" w:color="auto" w:val="clear"/>
+        <w:spacing w:after="0" w:before="0" w:line="240"/>
+        <w:ind w:left="360"/>
+      </w:pPr>
+      <w:r>
+        <w:rPr>
+          <w:rFonts w:ascii="Consolas" w:cs="Consolas" w:eastAsia="Consolas" w:hAnsi="Consolas"/>
+          <w:sz w:val="18"/>
+          <w:szCs w:val="18"/>
+        </w:rPr>
         <w:t xml:space="preserve">        } catch (const EntradaInvalidaException&amp; e) {</w:t>
       </w:r>
     </w:p>
@@ -5945,7 +6260,7 @@
           <w:sz w:val="18"/>
           <w:szCs w:val="18"/>
         </w:rPr>
-        <w:t xml:space="preserve">            throw ArchivoCorruptoException(ruta, numero, e.what());</w:t>
+        <w:t xml:space="preserve">            throw ArchivoCorruptoException(ruta, numeroLinea, e.what());</w:t>
       </w:r>
     </w:p>
     <w:p>
@@ -5976,6 +6291,21 @@
           <w:szCs w:val="18"/>
         </w:rPr>
         <w:t xml:space="preserve">    }</w:t>
+      </w:r>
+    </w:p>
+    <w:p>
+      <w:pPr>
+        <w:shd w:fill="F2F2F2" w:color="auto" w:val="clear"/>
+        <w:spacing w:after="0" w:before="0" w:line="240"/>
+        <w:ind w:left="360"/>
+      </w:pPr>
+      <w:r>
+        <w:rPr>
+          <w:rFonts w:ascii="Consolas" w:cs="Consolas" w:eastAsia="Consolas" w:hAnsi="Consolas"/>
+          <w:sz w:val="18"/>
+          <w:szCs w:val="18"/>
+        </w:rPr>
+        <w:t xml:space="preserve"> </w:t>
       </w:r>
     </w:p>
     <w:p>
@@ -8057,7 +8387,7 @@
       <w:r>
         <w:drawing>
           <wp:inline distT="0" distB="0" distL="0" distR="0">
-            <wp:extent cx="5486400" cy="1819275"/>
+            <wp:extent cx="5486400" cy="1562100"/>
             <wp:effectExtent t="0" r="0" b="0" l="0"/>
             <wp:docPr id="7" name=""/>
             <wp:cNvGraphicFramePr>
@@ -8082,7 +8412,7 @@
                   <pic:spPr bwMode="auto">
                     <a:xfrm>
                       <a:off x="0" y="0"/>
-                      <a:ext cx="5486400" cy="1819275"/>
+                      <a:ext cx="5486400" cy="1562100"/>
                     </a:xfrm>
                     <a:prstGeom prst="rect">
                       <a:avLst/>
@@ -8330,7 +8660,7 @@
       <w:r>
         <w:drawing>
           <wp:inline distT="0" distB="0" distL="0" distR="0">
-            <wp:extent cx="4857750" cy="7620000"/>
+            <wp:extent cx="4924425" cy="7620000"/>
             <wp:effectExtent t="0" r="0" b="0" l="0"/>
             <wp:docPr id="10" name=""/>
             <wp:cNvGraphicFramePr>
@@ -8355,7 +8685,7 @@
                   <pic:spPr bwMode="auto">
                     <a:xfrm>
                       <a:off x="0" y="0"/>
-                      <a:ext cx="4857750" cy="7620000"/>
+                      <a:ext cx="4924425" cy="7620000"/>
                     </a:xfrm>
                     <a:prstGeom prst="rect">
                       <a:avLst/>

</xml_diff>

<commit_message>
docs: actualizar informe con el código comentado
</commit_message>
<xml_diff>
--- a/informe/Informe_PRAC02_Manejo_de_Errores_Grupo1.docx
+++ b/informe/Informe_PRAC02_Manejo_de_Errores_Grupo1.docx
@@ -165,7 +165,7 @@
         <w:spacing w:after="300"/>
         <w:jc w:val="center"/>
       </w:pPr>
-      <w:hyperlink w:history="1" r:id="rIds8sjyblfu3ucb425ortb2">
+      <w:hyperlink w:history="1" r:id="rIdsme7jckjaj1vp2oqeazeg">
         <w:r>
           <w:rPr>
             <w:rStyle w:val="Hyperlink"/>
@@ -808,7 +808,7 @@
         </w:rPr>
         <w:t xml:space="preserve">El presente informe documenta la Práctica 02 del curso Tecnología de Objetos, desarrollada por el Grupo 1 en el lenguaje C++. Comprende dos actividades: la Práctica 1, División segura, y la Simulación de sistema, común a todos los grupos, en la que se construyó un sistema de registro de alumnos que integra el manejo de errores de entrada de datos, de archivos no encontrados o corruptos y de excepciones personalizadas. El código fuente se encuentra en el repositorio del grupo: </w:t>
       </w:r>
-      <w:hyperlink w:history="1" r:id="rIdyrd0w1z6ouxu2qzzxtkfq">
+      <w:hyperlink w:history="1" r:id="rIdc0ysm46d0ul0jeouodafx">
         <w:r>
           <w:rPr>
             <w:rStyle w:val="Hyperlink"/>
@@ -3175,6 +3175,51 @@
           <w:sz w:val="18"/>
           <w:szCs w:val="18"/>
         </w:rPr>
+        <w:t xml:space="preserve">// En C++ dividir entre cero no lanza una excepción por sí solo (con double da inf y con</w:t>
+      </w:r>
+    </w:p>
+    <w:p>
+      <w:pPr>
+        <w:shd w:fill="F2F2F2" w:color="auto" w:val="clear"/>
+        <w:spacing w:after="0" w:before="0" w:line="240"/>
+        <w:ind w:left="360"/>
+      </w:pPr>
+      <w:r>
+        <w:rPr>
+          <w:rFonts w:ascii="Consolas" w:cs="Consolas" w:eastAsia="Consolas" w:hAnsi="Consolas"/>
+          <w:sz w:val="18"/>
+          <w:szCs w:val="18"/>
+        </w:rPr>
+        <w:t xml:space="preserve">// enteros es comportamiento indefinido). Por eso se comprueba el divisor y se lanza</w:t>
+      </w:r>
+    </w:p>
+    <w:p>
+      <w:pPr>
+        <w:shd w:fill="F2F2F2" w:color="auto" w:val="clear"/>
+        <w:spacing w:after="0" w:before="0" w:line="240"/>
+        <w:ind w:left="360"/>
+      </w:pPr>
+      <w:r>
+        <w:rPr>
+          <w:rFonts w:ascii="Consolas" w:cs="Consolas" w:eastAsia="Consolas" w:hAnsi="Consolas"/>
+          <w:sz w:val="18"/>
+          <w:szCs w:val="18"/>
+        </w:rPr>
+        <w:t xml:space="preserve">// std::domain_error con throw.</w:t>
+      </w:r>
+    </w:p>
+    <w:p>
+      <w:pPr>
+        <w:shd w:fill="F2F2F2" w:color="auto" w:val="clear"/>
+        <w:spacing w:after="0" w:before="0" w:line="240"/>
+        <w:ind w:left="360"/>
+      </w:pPr>
+      <w:r>
+        <w:rPr>
+          <w:rFonts w:ascii="Consolas" w:cs="Consolas" w:eastAsia="Consolas" w:hAnsi="Consolas"/>
+          <w:sz w:val="18"/>
+          <w:szCs w:val="18"/>
+        </w:rPr>
         <w:t xml:space="preserve">double dividir(double dividendo, double divisor) {</w:t>
       </w:r>
     </w:p>
@@ -3280,6 +3325,21 @@
           <w:sz w:val="18"/>
           <w:szCs w:val="18"/>
         </w:rPr>
+        <w:t xml:space="preserve">// Lee un número; si el usuario escribe texto, cin falla y se lanza std::invalid_argument.</w:t>
+      </w:r>
+    </w:p>
+    <w:p>
+      <w:pPr>
+        <w:shd w:fill="F2F2F2" w:color="auto" w:val="clear"/>
+        <w:spacing w:after="0" w:before="0" w:line="240"/>
+        <w:ind w:left="360"/>
+      </w:pPr>
+      <w:r>
+        <w:rPr>
+          <w:rFonts w:ascii="Consolas" w:cs="Consolas" w:eastAsia="Consolas" w:hAnsi="Consolas"/>
+          <w:sz w:val="18"/>
+          <w:szCs w:val="18"/>
+        </w:rPr>
         <w:t xml:space="preserve">double leerNumero(const std::string&amp; mensaje) {</w:t>
       </w:r>
     </w:p>
@@ -3460,7 +3520,67 @@
           <w:sz w:val="18"/>
           <w:szCs w:val="18"/>
         </w:rPr>
+        <w:t xml:space="preserve">        // Se declara fuera del try: su destructor se ejecuta al cerrar este bloque, después</w:t>
+      </w:r>
+    </w:p>
+    <w:p>
+      <w:pPr>
+        <w:shd w:fill="F2F2F2" w:color="auto" w:val="clear"/>
+        <w:spacing w:after="0" w:before="0" w:line="240"/>
+        <w:ind w:left="360"/>
+      </w:pPr>
+      <w:r>
+        <w:rPr>
+          <w:rFonts w:ascii="Consolas" w:cs="Consolas" w:eastAsia="Consolas" w:hAnsi="Consolas"/>
+          <w:sz w:val="18"/>
+          <w:szCs w:val="18"/>
+        </w:rPr>
+        <w:t xml:space="preserve">        // del try y del catch, igual que un bloque finally.</w:t>
+      </w:r>
+    </w:p>
+    <w:p>
+      <w:pPr>
+        <w:shd w:fill="F2F2F2" w:color="auto" w:val="clear"/>
+        <w:spacing w:after="0" w:before="0" w:line="240"/>
+        <w:ind w:left="360"/>
+      </w:pPr>
+      <w:r>
+        <w:rPr>
+          <w:rFonts w:ascii="Consolas" w:cs="Consolas" w:eastAsia="Consolas" w:hAnsi="Consolas"/>
+          <w:sz w:val="18"/>
+          <w:szCs w:val="18"/>
+        </w:rPr>
         <w:t xml:space="preserve">        MensajeCierre cierre;</w:t>
+      </w:r>
+    </w:p>
+    <w:p>
+      <w:pPr>
+        <w:shd w:fill="F2F2F2" w:color="auto" w:val="clear"/>
+        <w:spacing w:after="0" w:before="0" w:line="240"/>
+        <w:ind w:left="360"/>
+      </w:pPr>
+      <w:r>
+        <w:rPr>
+          <w:rFonts w:ascii="Consolas" w:cs="Consolas" w:eastAsia="Consolas" w:hAnsi="Consolas"/>
+          <w:sz w:val="18"/>
+          <w:szCs w:val="18"/>
+        </w:rPr>
+        <w:t xml:space="preserve">        // Si dividir() o leerNumero() lanzan una excepción, el resto del try se salta y el</w:t>
+      </w:r>
+    </w:p>
+    <w:p>
+      <w:pPr>
+        <w:shd w:fill="F2F2F2" w:color="auto" w:val="clear"/>
+        <w:spacing w:after="0" w:before="0" w:line="240"/>
+        <w:ind w:left="360"/>
+      </w:pPr>
+      <w:r>
+        <w:rPr>
+          <w:rFonts w:ascii="Consolas" w:cs="Consolas" w:eastAsia="Consolas" w:hAnsi="Consolas"/>
+          <w:sz w:val="18"/>
+          <w:szCs w:val="18"/>
+        </w:rPr>
+        <w:t xml:space="preserve">        // control pasa al catch cuyo tipo coincide.</w:t>
       </w:r>
     </w:p>
     <w:p>
@@ -4901,6 +5021,21 @@
           <w:sz w:val="18"/>
           <w:szCs w:val="18"/>
         </w:rPr>
+        <w:t xml:space="preserve">// Clase base: hereda de std::runtime_error, que guarda el mensaje y lo devuelve con what().</w:t>
+      </w:r>
+    </w:p>
+    <w:p>
+      <w:pPr>
+        <w:shd w:fill="F2F2F2" w:color="auto" w:val="clear"/>
+        <w:spacing w:after="0" w:before="0" w:line="240"/>
+        <w:ind w:left="360"/>
+      </w:pPr>
+      <w:r>
+        <w:rPr>
+          <w:rFonts w:ascii="Consolas" w:cs="Consolas" w:eastAsia="Consolas" w:hAnsi="Consolas"/>
+          <w:sz w:val="18"/>
+          <w:szCs w:val="18"/>
+        </w:rPr>
         <w:t xml:space="preserve">RegistroException::RegistroException(const std::string&amp; mensaje)</w:t>
       </w:r>
     </w:p>
@@ -4946,6 +5081,36 @@
           <w:sz w:val="18"/>
           <w:szCs w:val="18"/>
         </w:rPr>
+        <w:t xml:space="preserve">// El mensaje combina el campo y el motivo, por ejemplo "edad: El valor ingresado no es...".</w:t>
+      </w:r>
+    </w:p>
+    <w:p>
+      <w:pPr>
+        <w:shd w:fill="F2F2F2" w:color="auto" w:val="clear"/>
+        <w:spacing w:after="0" w:before="0" w:line="240"/>
+        <w:ind w:left="360"/>
+      </w:pPr>
+      <w:r>
+        <w:rPr>
+          <w:rFonts w:ascii="Consolas" w:cs="Consolas" w:eastAsia="Consolas" w:hAnsi="Consolas"/>
+          <w:sz w:val="18"/>
+          <w:szCs w:val="18"/>
+        </w:rPr>
+        <w:t xml:space="preserve">// Además se guarda el campo por si quien captura necesita saber qué dato falló.</w:t>
+      </w:r>
+    </w:p>
+    <w:p>
+      <w:pPr>
+        <w:shd w:fill="F2F2F2" w:color="auto" w:val="clear"/>
+        <w:spacing w:after="0" w:before="0" w:line="240"/>
+        <w:ind w:left="360"/>
+      </w:pPr>
+      <w:r>
+        <w:rPr>
+          <w:rFonts w:ascii="Consolas" w:cs="Consolas" w:eastAsia="Consolas" w:hAnsi="Consolas"/>
+          <w:sz w:val="18"/>
+          <w:szCs w:val="18"/>
+        </w:rPr>
         <w:t xml:space="preserve">EntradaInvalidaException::EntradaInvalidaException(const std::string&amp; campo,</w:t>
       </w:r>
     </w:p>
@@ -5036,6 +5201,21 @@
           <w:sz w:val="18"/>
           <w:szCs w:val="18"/>
         </w:rPr>
+        <w:t xml:space="preserve">// Se lanza cuando el archivo de datos no existe o no se puede abrir.</w:t>
+      </w:r>
+    </w:p>
+    <w:p>
+      <w:pPr>
+        <w:shd w:fill="F2F2F2" w:color="auto" w:val="clear"/>
+        <w:spacing w:after="0" w:before="0" w:line="240"/>
+        <w:ind w:left="360"/>
+      </w:pPr>
+      <w:r>
+        <w:rPr>
+          <w:rFonts w:ascii="Consolas" w:cs="Consolas" w:eastAsia="Consolas" w:hAnsi="Consolas"/>
+          <w:sz w:val="18"/>
+          <w:szCs w:val="18"/>
+        </w:rPr>
         <w:t xml:space="preserve">ArchivoNoEncontradoException::ArchivoNoEncontradoException(const std::string&amp; ruta)</w:t>
       </w:r>
     </w:p>
@@ -5081,6 +5261,21 @@
           <w:sz w:val="18"/>
           <w:szCs w:val="18"/>
         </w:rPr>
+        <w:t xml:space="preserve">// Incluye el número de línea para que el usuario sepa dónde está el dato dañado.</w:t>
+      </w:r>
+    </w:p>
+    <w:p>
+      <w:pPr>
+        <w:shd w:fill="F2F2F2" w:color="auto" w:val="clear"/>
+        <w:spacing w:after="0" w:before="0" w:line="240"/>
+        <w:ind w:left="360"/>
+      </w:pPr>
+      <w:r>
+        <w:rPr>
+          <w:rFonts w:ascii="Consolas" w:cs="Consolas" w:eastAsia="Consolas" w:hAnsi="Consolas"/>
+          <w:sz w:val="18"/>
+          <w:szCs w:val="18"/>
+        </w:rPr>
         <w:t xml:space="preserve">ArchivoCorruptoException::ArchivoCorruptoException(const std::string&amp; ruta, int linea,</w:t>
       </w:r>
     </w:p>
@@ -5186,6 +5381,21 @@
           <w:sz w:val="18"/>
           <w:szCs w:val="18"/>
         </w:rPr>
+        <w:t xml:space="preserve">// Excepción del dominio: se lanza al buscar o eliminar un código que no está registrado.</w:t>
+      </w:r>
+    </w:p>
+    <w:p>
+      <w:pPr>
+        <w:shd w:fill="F2F2F2" w:color="auto" w:val="clear"/>
+        <w:spacing w:after="0" w:before="0" w:line="240"/>
+        <w:ind w:left="360"/>
+      </w:pPr>
+      <w:r>
+        <w:rPr>
+          <w:rFonts w:ascii="Consolas" w:cs="Consolas" w:eastAsia="Consolas" w:hAnsi="Consolas"/>
+          <w:sz w:val="18"/>
+          <w:szCs w:val="18"/>
+        </w:rPr>
         <w:t xml:space="preserve">AlumnoNoEncontradoException::AlumnoNoEncontradoException(const std::string&amp; codigo)</w:t>
       </w:r>
     </w:p>
@@ -5217,6 +5427,21 @@
           <w:szCs w:val="18"/>
         </w:rPr>
         <w:t xml:space="preserve"> </w:t>
+      </w:r>
+    </w:p>
+    <w:p>
+      <w:pPr>
+        <w:shd w:fill="F2F2F2" w:color="auto" w:val="clear"/>
+        <w:spacing w:after="0" w:before="0" w:line="240"/>
+        <w:ind w:left="360"/>
+      </w:pPr>
+      <w:r>
+        <w:rPr>
+          <w:rFonts w:ascii="Consolas" w:cs="Consolas" w:eastAsia="Consolas" w:hAnsi="Consolas"/>
+          <w:sz w:val="18"/>
+          <w:szCs w:val="18"/>
+        </w:rPr>
+        <w:t xml:space="preserve">// Se lanza al registrar un código que ya existe, para no tener dos alumnos con el mismo CUI.</w:t>
       </w:r>
     </w:p>
     <w:p>
@@ -5333,6 +5558,51 @@
           <w:sz w:val="18"/>
           <w:szCs w:val="18"/>
         </w:rPr>
+        <w:t xml:space="preserve">    // std::stoi lanza std::invalid_argument si el texto no empieza con un número y</w:t>
+      </w:r>
+    </w:p>
+    <w:p>
+      <w:pPr>
+        <w:shd w:fill="F2F2F2" w:color="auto" w:val="clear"/>
+        <w:spacing w:after="0" w:before="0" w:line="240"/>
+        <w:ind w:left="360"/>
+      </w:pPr>
+      <w:r>
+        <w:rPr>
+          <w:rFonts w:ascii="Consolas" w:cs="Consolas" w:eastAsia="Consolas" w:hAnsi="Consolas"/>
+          <w:sz w:val="18"/>
+          <w:szCs w:val="18"/>
+        </w:rPr>
+        <w:t xml:space="preserve">    // std::out_of_range si el número no cabe en un int. Ambas se traducen a la</w:t>
+      </w:r>
+    </w:p>
+    <w:p>
+      <w:pPr>
+        <w:shd w:fill="F2F2F2" w:color="auto" w:val="clear"/>
+        <w:spacing w:after="0" w:before="0" w:line="240"/>
+        <w:ind w:left="360"/>
+      </w:pPr>
+      <w:r>
+        <w:rPr>
+          <w:rFonts w:ascii="Consolas" w:cs="Consolas" w:eastAsia="Consolas" w:hAnsi="Consolas"/>
+          <w:sz w:val="18"/>
+          <w:szCs w:val="18"/>
+        </w:rPr>
+        <w:t xml:space="preserve">    // excepción propia del sistema con un mensaje claro.</w:t>
+      </w:r>
+    </w:p>
+    <w:p>
+      <w:pPr>
+        <w:shd w:fill="F2F2F2" w:color="auto" w:val="clear"/>
+        <w:spacing w:after="0" w:before="0" w:line="240"/>
+        <w:ind w:left="360"/>
+      </w:pPr>
+      <w:r>
+        <w:rPr>
+          <w:rFonts w:ascii="Consolas" w:cs="Consolas" w:eastAsia="Consolas" w:hAnsi="Consolas"/>
+          <w:sz w:val="18"/>
+          <w:szCs w:val="18"/>
+        </w:rPr>
         <w:t xml:space="preserve">    try {</w:t>
       </w:r>
     </w:p>
@@ -5453,6 +5723,36 @@
           <w:sz w:val="18"/>
           <w:szCs w:val="18"/>
         </w:rPr>
+        <w:t xml:space="preserve">    // pos indica cuántos caracteres se convirtieron: si no es todo el texto, había</w:t>
+      </w:r>
+    </w:p>
+    <w:p>
+      <w:pPr>
+        <w:shd w:fill="F2F2F2" w:color="auto" w:val="clear"/>
+        <w:spacing w:after="0" w:before="0" w:line="240"/>
+        <w:ind w:left="360"/>
+      </w:pPr>
+      <w:r>
+        <w:rPr>
+          <w:rFonts w:ascii="Consolas" w:cs="Consolas" w:eastAsia="Consolas" w:hAnsi="Consolas"/>
+          <w:sz w:val="18"/>
+          <w:szCs w:val="18"/>
+        </w:rPr>
+        <w:t xml:space="preserve">    // algo más después del número (por ejemplo "12abc").</w:t>
+      </w:r>
+    </w:p>
+    <w:p>
+      <w:pPr>
+        <w:shd w:fill="F2F2F2" w:color="auto" w:val="clear"/>
+        <w:spacing w:after="0" w:before="0" w:line="240"/>
+        <w:ind w:left="360"/>
+      </w:pPr>
+      <w:r>
+        <w:rPr>
+          <w:rFonts w:ascii="Consolas" w:cs="Consolas" w:eastAsia="Consolas" w:hAnsi="Consolas"/>
+          <w:sz w:val="18"/>
+          <w:szCs w:val="18"/>
+        </w:rPr>
         <w:t xml:space="preserve">    if (pos != texto.size()) {</w:t>
       </w:r>
     </w:p>
@@ -5499,6 +5799,21 @@
           <w:szCs w:val="18"/>
         </w:rPr>
         <w:t xml:space="preserve"> </w:t>
+      </w:r>
+    </w:p>
+    <w:p>
+      <w:pPr>
+        <w:shd w:fill="F2F2F2" w:color="auto" w:val="clear"/>
+        <w:spacing w:after="0" w:before="0" w:line="240"/>
+        <w:ind w:left="360"/>
+      </w:pPr>
+      <w:r>
+        <w:rPr>
+          <w:rFonts w:ascii="Consolas" w:cs="Consolas" w:eastAsia="Consolas" w:hAnsi="Consolas"/>
+          <w:sz w:val="18"/>
+          <w:szCs w:val="18"/>
+        </w:rPr>
+        <w:t xml:space="preserve">    // El número es válido, pero también debe estar dentro del rango permitido.</w:t>
       </w:r>
     </w:p>
     <w:p>
@@ -5735,6 +6050,21 @@
           <w:sz w:val="18"/>
           <w:szCs w:val="18"/>
         </w:rPr>
+        <w:t xml:space="preserve">    // Se cuenta el número de línea para indicarlo en el mensaje de error.</w:t>
+      </w:r>
+    </w:p>
+    <w:p>
+      <w:pPr>
+        <w:shd w:fill="F2F2F2" w:color="auto" w:val="clear"/>
+        <w:spacing w:after="0" w:before="0" w:line="240"/>
+        <w:ind w:left="360"/>
+      </w:pPr>
+      <w:r>
+        <w:rPr>
+          <w:rFonts w:ascii="Consolas" w:cs="Consolas" w:eastAsia="Consolas" w:hAnsi="Consolas"/>
+          <w:sz w:val="18"/>
+          <w:szCs w:val="18"/>
+        </w:rPr>
         <w:t xml:space="preserve">    int numeroLinea = 0;</w:t>
       </w:r>
     </w:p>
@@ -5915,6 +6245,21 @@
           <w:sz w:val="18"/>
           <w:szCs w:val="18"/>
         </w:rPr>
+        <w:t xml:space="preserve">        // Separa la línea en campos usando ';' como delimitador.</w:t>
+      </w:r>
+    </w:p>
+    <w:p>
+      <w:pPr>
+        <w:shd w:fill="F2F2F2" w:color="auto" w:val="clear"/>
+        <w:spacing w:after="0" w:before="0" w:line="240"/>
+        <w:ind w:left="360"/>
+      </w:pPr>
+      <w:r>
+        <w:rPr>
+          <w:rFonts w:ascii="Consolas" w:cs="Consolas" w:eastAsia="Consolas" w:hAnsi="Consolas"/>
+          <w:sz w:val="18"/>
+          <w:szCs w:val="18"/>
+        </w:rPr>
         <w:t xml:space="preserve">        std::stringstream ss(linea);</w:t>
       </w:r>
     </w:p>
@@ -6035,6 +6380,21 @@
           <w:sz w:val="18"/>
           <w:szCs w:val="18"/>
         </w:rPr>
+        <w:t xml:space="preserve">        // Cada línea debe tener exactamente código, nombre, edad y nota.</w:t>
+      </w:r>
+    </w:p>
+    <w:p>
+      <w:pPr>
+        <w:shd w:fill="F2F2F2" w:color="auto" w:val="clear"/>
+        <w:spacing w:after="0" w:before="0" w:line="240"/>
+        <w:ind w:left="360"/>
+      </w:pPr>
+      <w:r>
+        <w:rPr>
+          <w:rFonts w:ascii="Consolas" w:cs="Consolas" w:eastAsia="Consolas" w:hAnsi="Consolas"/>
+          <w:sz w:val="18"/>
+          <w:szCs w:val="18"/>
+        </w:rPr>
         <w:t xml:space="preserve">        if (campos.size() != 4) {</w:t>
       </w:r>
     </w:p>
@@ -6081,6 +6441,36 @@
           <w:szCs w:val="18"/>
         </w:rPr>
         <w:t xml:space="preserve"> </w:t>
+      </w:r>
+    </w:p>
+    <w:p>
+      <w:pPr>
+        <w:shd w:fill="F2F2F2" w:color="auto" w:val="clear"/>
+        <w:spacing w:after="0" w:before="0" w:line="240"/>
+        <w:ind w:left="360"/>
+      </w:pPr>
+      <w:r>
+        <w:rPr>
+          <w:rFonts w:ascii="Consolas" w:cs="Consolas" w:eastAsia="Consolas" w:hAnsi="Consolas"/>
+          <w:sz w:val="18"/>
+          <w:szCs w:val="18"/>
+        </w:rPr>
+        <w:t xml:space="preserve">        // Si alguna validación falla, el catch transforma la EntradaInvalidaException en</w:t>
+      </w:r>
+    </w:p>
+    <w:p>
+      <w:pPr>
+        <w:shd w:fill="F2F2F2" w:color="auto" w:val="clear"/>
+        <w:spacing w:after="0" w:before="0" w:line="240"/>
+        <w:ind w:left="360"/>
+      </w:pPr>
+      <w:r>
+        <w:rPr>
+          <w:rFonts w:ascii="Consolas" w:cs="Consolas" w:eastAsia="Consolas" w:hAnsi="Consolas"/>
+          <w:sz w:val="18"/>
+          <w:szCs w:val="18"/>
+        </w:rPr>
+        <w:t xml:space="preserve">        // ArchivoCorruptoException y le agrega la línea donde ocurrió.</w:t>
       </w:r>
     </w:p>
     <w:p>

</xml_diff>